<commit_message>
pdf created for comparison
</commit_message>
<xml_diff>
--- a/tubitak report/215E248G04.docx
+++ b/tubitak report/215E248G04.docx
@@ -35,6 +35,8 @@
                 <w:szCs w:val="20"/>
               </w:rPr>
             </w:pPr>
+            <w:bookmarkStart w:id="0" w:name="_GoBack"/>
+            <w:bookmarkEnd w:id="0"/>
           </w:p>
           <w:p>
             <w:pPr>
@@ -2524,35 +2526,25 @@
           <w:lang w:eastAsia="tr-TR"/>
         </w:rPr>
       </w:pPr>
-      <w:bookmarkStart w:id="0" w:name="_Toc12497114"/>
+      <w:bookmarkStart w:id="1" w:name="_Toc12497114"/>
       <w:r>
         <w:t xml:space="preserve">Şekil </w:t>
       </w:r>
-      <w:r>
-        <w:fldChar w:fldCharType="begin"/>
-      </w:r>
-      <w:r>
-        <w:instrText xml:space="preserve"> SEQ Şekil \* ARABIC </w:instrText>
-      </w:r>
-      <w:r>
-        <w:fldChar w:fldCharType="separate"/>
-      </w:r>
-      <w:r>
-        <w:rPr>
-          <w:noProof/>
-        </w:rPr>
-        <w:t>1</w:t>
-      </w:r>
-      <w:r>
-        <w:fldChar w:fldCharType="end"/>
-      </w:r>
+      <w:fldSimple w:instr=" SEQ Şekil \* ARABIC ">
+        <w:r>
+          <w:rPr>
+            <w:noProof/>
+          </w:rPr>
+          <w:t>1</w:t>
+        </w:r>
+      </w:fldSimple>
       <w:r>
         <w:t xml:space="preserve">. </w:t>
       </w:r>
       <w:r>
         <w:t>İki model içinde oluşturulmuş olan bir örnek yapay sinir ağı modellemesi</w:t>
       </w:r>
-      <w:bookmarkEnd w:id="0"/>
+      <w:bookmarkEnd w:id="1"/>
     </w:p>
     <w:p>
       <w:pPr>
@@ -2774,35 +2766,25 @@
           <w:lang w:eastAsia="tr-TR"/>
         </w:rPr>
       </w:pPr>
-      <w:bookmarkStart w:id="1" w:name="_Toc12497115"/>
+      <w:bookmarkStart w:id="2" w:name="_Toc12497115"/>
       <w:r>
         <w:t xml:space="preserve">Şekil </w:t>
       </w:r>
-      <w:r>
-        <w:fldChar w:fldCharType="begin"/>
-      </w:r>
-      <w:r>
-        <w:instrText xml:space="preserve"> SEQ Şekil \* ARABIC </w:instrText>
-      </w:r>
-      <w:r>
-        <w:fldChar w:fldCharType="separate"/>
-      </w:r>
-      <w:r>
-        <w:rPr>
-          <w:noProof/>
-        </w:rPr>
-        <w:t>2</w:t>
-      </w:r>
-      <w:r>
-        <w:fldChar w:fldCharType="end"/>
-      </w:r>
+      <w:fldSimple w:instr=" SEQ Şekil \* ARABIC ">
+        <w:r>
+          <w:rPr>
+            <w:noProof/>
+          </w:rPr>
+          <w:t>2</w:t>
+        </w:r>
+      </w:fldSimple>
       <w:r>
         <w:t xml:space="preserve">. </w:t>
       </w:r>
       <w:r>
         <w:t>LSTM hücresinin örnek hali</w:t>
       </w:r>
-      <w:bookmarkEnd w:id="1"/>
+      <w:bookmarkEnd w:id="2"/>
     </w:p>
     <w:p>
       <w:pPr>
@@ -3159,35 +3141,25 @@
           <w:lang w:eastAsia="tr-TR"/>
         </w:rPr>
       </w:pPr>
-      <w:bookmarkStart w:id="2" w:name="_Toc12497116"/>
+      <w:bookmarkStart w:id="3" w:name="_Toc12497116"/>
       <w:r>
         <w:t xml:space="preserve">Şekil </w:t>
       </w:r>
-      <w:r>
-        <w:fldChar w:fldCharType="begin"/>
-      </w:r>
-      <w:r>
-        <w:instrText xml:space="preserve"> SEQ Şekil \* ARABIC </w:instrText>
-      </w:r>
-      <w:r>
-        <w:fldChar w:fldCharType="separate"/>
-      </w:r>
-      <w:r>
-        <w:rPr>
-          <w:noProof/>
-        </w:rPr>
-        <w:t>3</w:t>
-      </w:r>
-      <w:r>
-        <w:fldChar w:fldCharType="end"/>
-      </w:r>
+      <w:fldSimple w:instr=" SEQ Şekil \* ARABIC ">
+        <w:r>
+          <w:rPr>
+            <w:noProof/>
+          </w:rPr>
+          <w:t>3</w:t>
+        </w:r>
+      </w:fldSimple>
       <w:r>
         <w:t xml:space="preserve">. </w:t>
       </w:r>
       <w:r>
         <w:t>Projede kullanılan LSTM Modelinin genel iskelet yapısı</w:t>
       </w:r>
-      <w:bookmarkEnd w:id="2"/>
+      <w:bookmarkEnd w:id="3"/>
     </w:p>
     <w:p>
       <w:pPr>
@@ -3612,35 +3584,25 @@
         <w:pStyle w:val="Caption"/>
         <w:keepNext/>
       </w:pPr>
-      <w:bookmarkStart w:id="3" w:name="_Toc12497224"/>
+      <w:bookmarkStart w:id="4" w:name="_Toc12497224"/>
       <w:r>
         <w:t xml:space="preserve">Tablo </w:t>
       </w:r>
-      <w:r>
-        <w:fldChar w:fldCharType="begin"/>
-      </w:r>
-      <w:r>
-        <w:instrText xml:space="preserve"> SEQ Tablo \* ARABIC </w:instrText>
-      </w:r>
-      <w:r>
-        <w:fldChar w:fldCharType="separate"/>
-      </w:r>
-      <w:r>
-        <w:rPr>
-          <w:noProof/>
-        </w:rPr>
-        <w:t>1</w:t>
-      </w:r>
-      <w:r>
-        <w:fldChar w:fldCharType="end"/>
-      </w:r>
+      <w:fldSimple w:instr=" SEQ Tablo \* ARABIC ">
+        <w:r>
+          <w:rPr>
+            <w:noProof/>
+          </w:rPr>
+          <w:t>1</w:t>
+        </w:r>
+      </w:fldSimple>
       <w:r>
         <w:t xml:space="preserve">. </w:t>
       </w:r>
       <w:r>
         <w:t>MSE değerleri tüm agentlar ve orijinal veri arasında</w:t>
       </w:r>
-      <w:bookmarkEnd w:id="3"/>
+      <w:bookmarkEnd w:id="4"/>
     </w:p>
     <w:tbl>
       <w:tblPr>
@@ -5671,35 +5633,25 @@
         <w:pStyle w:val="Caption"/>
         <w:keepNext/>
       </w:pPr>
-      <w:bookmarkStart w:id="4" w:name="_Toc12497225"/>
+      <w:bookmarkStart w:id="5" w:name="_Toc12497225"/>
       <w:r>
         <w:t xml:space="preserve">Tablo </w:t>
       </w:r>
-      <w:r>
-        <w:fldChar w:fldCharType="begin"/>
-      </w:r>
-      <w:r>
-        <w:instrText xml:space="preserve"> SEQ Tablo \* ARABIC </w:instrText>
-      </w:r>
-      <w:r>
-        <w:fldChar w:fldCharType="separate"/>
-      </w:r>
-      <w:r>
-        <w:rPr>
-          <w:noProof/>
-        </w:rPr>
-        <w:t>2</w:t>
-      </w:r>
-      <w:r>
-        <w:fldChar w:fldCharType="end"/>
-      </w:r>
+      <w:fldSimple w:instr=" SEQ Tablo \* ARABIC ">
+        <w:r>
+          <w:rPr>
+            <w:noProof/>
+          </w:rPr>
+          <w:t>2</w:t>
+        </w:r>
+      </w:fldSimple>
       <w:r>
         <w:t xml:space="preserve">. </w:t>
       </w:r>
       <w:r>
         <w:t>Kesinlik değerleri tüm agentlar ve orijinal veri arasında</w:t>
       </w:r>
-      <w:bookmarkEnd w:id="4"/>
+      <w:bookmarkEnd w:id="5"/>
     </w:p>
     <w:tbl>
       <w:tblPr>
@@ -7820,36 +7772,26 @@
         <w:pStyle w:val="Caption"/>
         <w:keepNext/>
       </w:pPr>
-      <w:bookmarkStart w:id="5" w:name="_Toc12497226"/>
+      <w:bookmarkStart w:id="6" w:name="_Toc12497226"/>
       <w:r>
         <w:lastRenderedPageBreak/>
         <w:t xml:space="preserve">Tablo </w:t>
       </w:r>
-      <w:r>
-        <w:fldChar w:fldCharType="begin"/>
-      </w:r>
-      <w:r>
-        <w:instrText xml:space="preserve"> SEQ Tablo \* ARABIC </w:instrText>
-      </w:r>
-      <w:r>
-        <w:fldChar w:fldCharType="separate"/>
-      </w:r>
-      <w:r>
-        <w:rPr>
-          <w:noProof/>
-        </w:rPr>
-        <w:t>3</w:t>
-      </w:r>
-      <w:r>
-        <w:fldChar w:fldCharType="end"/>
-      </w:r>
+      <w:fldSimple w:instr=" SEQ Tablo \* ARABIC ">
+        <w:r>
+          <w:rPr>
+            <w:noProof/>
+          </w:rPr>
+          <w:t>3</w:t>
+        </w:r>
+      </w:fldSimple>
       <w:r>
         <w:t xml:space="preserve">. </w:t>
       </w:r>
       <w:r>
         <w:t>:DTW(dynamic time warping) değerleri tüm agentlar ve lstm arasında</w:t>
       </w:r>
-      <w:bookmarkEnd w:id="5"/>
+      <w:bookmarkEnd w:id="6"/>
     </w:p>
     <w:tbl>
       <w:tblPr>
@@ -9743,35 +9685,25 @@
         <w:pStyle w:val="Caption"/>
         <w:keepNext/>
       </w:pPr>
-      <w:bookmarkStart w:id="6" w:name="_Toc12497227"/>
+      <w:bookmarkStart w:id="7" w:name="_Toc12497227"/>
       <w:r>
         <w:t xml:space="preserve">Tablo </w:t>
       </w:r>
-      <w:r>
-        <w:fldChar w:fldCharType="begin"/>
-      </w:r>
-      <w:r>
-        <w:instrText xml:space="preserve"> SEQ Tablo \* ARABIC </w:instrText>
-      </w:r>
-      <w:r>
-        <w:fldChar w:fldCharType="separate"/>
-      </w:r>
-      <w:r>
-        <w:rPr>
-          <w:noProof/>
-        </w:rPr>
-        <w:t>4</w:t>
-      </w:r>
-      <w:r>
-        <w:fldChar w:fldCharType="end"/>
-      </w:r>
+      <w:fldSimple w:instr=" SEQ Tablo \* ARABIC ">
+        <w:r>
+          <w:rPr>
+            <w:noProof/>
+          </w:rPr>
+          <w:t>4</w:t>
+        </w:r>
+      </w:fldSimple>
       <w:r>
         <w:t xml:space="preserve">. </w:t>
       </w:r>
       <w:r>
         <w:t>:MSE değerleri lstm decider ve tüm agentlar arası</w:t>
       </w:r>
-      <w:bookmarkEnd w:id="6"/>
+      <w:bookmarkEnd w:id="7"/>
     </w:p>
     <w:tbl>
       <w:tblPr>
@@ -11639,41 +11571,31 @@
         <w:pStyle w:val="Caption"/>
         <w:keepNext/>
       </w:pPr>
-      <w:bookmarkStart w:id="7" w:name="_Toc12497228"/>
+      <w:bookmarkStart w:id="8" w:name="_Toc12497228"/>
       <w:r>
         <w:t xml:space="preserve">Tablo </w:t>
       </w:r>
-      <w:r>
-        <w:fldChar w:fldCharType="begin"/>
-      </w:r>
-      <w:r>
-        <w:instrText xml:space="preserve"> SEQ Tablo \* ARABIC </w:instrText>
-      </w:r>
-      <w:r>
-        <w:fldChar w:fldCharType="separate"/>
-      </w:r>
+      <w:fldSimple w:instr=" SEQ Tablo \* ARABIC ">
+        <w:r>
+          <w:rPr>
+            <w:noProof/>
+          </w:rPr>
+          <w:t>5</w:t>
+        </w:r>
+      </w:fldSimple>
       <w:r>
         <w:rPr>
           <w:noProof/>
         </w:rPr>
-        <w:t>5</w:t>
-      </w:r>
-      <w:r>
-        <w:fldChar w:fldCharType="end"/>
+        <w:t>. K</w:t>
       </w:r>
       <w:r>
         <w:rPr>
           <w:noProof/>
         </w:rPr>
-        <w:t>. K</w:t>
-      </w:r>
-      <w:r>
-        <w:rPr>
-          <w:noProof/>
-        </w:rPr>
         <w:t>esinlik değerleri lstm decider ve tüm agentlar arası</w:t>
       </w:r>
-      <w:bookmarkEnd w:id="7"/>
+      <w:bookmarkEnd w:id="8"/>
     </w:p>
     <w:tbl>
       <w:tblPr>
@@ -13514,35 +13436,25 @@
         <w:pStyle w:val="Caption"/>
         <w:keepNext/>
       </w:pPr>
-      <w:bookmarkStart w:id="8" w:name="_Toc12497229"/>
+      <w:bookmarkStart w:id="9" w:name="_Toc12497229"/>
       <w:r>
         <w:t xml:space="preserve">Tablo </w:t>
       </w:r>
-      <w:r>
-        <w:fldChar w:fldCharType="begin"/>
-      </w:r>
-      <w:r>
-        <w:instrText xml:space="preserve"> SEQ Tablo \* ARABIC </w:instrText>
-      </w:r>
-      <w:r>
-        <w:fldChar w:fldCharType="separate"/>
-      </w:r>
-      <w:r>
-        <w:rPr>
-          <w:noProof/>
-        </w:rPr>
-        <w:t>6</w:t>
-      </w:r>
-      <w:r>
-        <w:fldChar w:fldCharType="end"/>
-      </w:r>
+      <w:fldSimple w:instr=" SEQ Tablo \* ARABIC ">
+        <w:r>
+          <w:rPr>
+            <w:noProof/>
+          </w:rPr>
+          <w:t>6</w:t>
+        </w:r>
+      </w:fldSimple>
       <w:r>
         <w:t xml:space="preserve">. </w:t>
       </w:r>
       <w:r>
         <w:t>Dtw değerleri lstm decider ve tüm agentlar arası</w:t>
       </w:r>
-      <w:bookmarkEnd w:id="8"/>
+      <w:bookmarkEnd w:id="9"/>
     </w:p>
     <w:tbl>
       <w:tblPr>
@@ -15401,35 +15313,25 @@
         <w:pStyle w:val="Caption"/>
         <w:keepNext/>
       </w:pPr>
-      <w:bookmarkStart w:id="9" w:name="_Toc12497230"/>
+      <w:bookmarkStart w:id="10" w:name="_Toc12497230"/>
       <w:r>
         <w:t xml:space="preserve">Tablo </w:t>
       </w:r>
-      <w:r>
-        <w:fldChar w:fldCharType="begin"/>
-      </w:r>
-      <w:r>
-        <w:instrText xml:space="preserve"> SEQ Tablo \* ARABIC </w:instrText>
-      </w:r>
-      <w:r>
-        <w:fldChar w:fldCharType="separate"/>
-      </w:r>
-      <w:r>
-        <w:rPr>
-          <w:noProof/>
-        </w:rPr>
-        <w:t>7</w:t>
-      </w:r>
-      <w:r>
-        <w:fldChar w:fldCharType="end"/>
-      </w:r>
+      <w:fldSimple w:instr=" SEQ Tablo \* ARABIC ">
+        <w:r>
+          <w:rPr>
+            <w:noProof/>
+          </w:rPr>
+          <w:t>7</w:t>
+        </w:r>
+      </w:fldSimple>
       <w:r>
         <w:t xml:space="preserve">. </w:t>
       </w:r>
       <w:r>
         <w:t>Korelasyon değerleri lstm decider ve tüm agentlar arası</w:t>
       </w:r>
-      <w:bookmarkEnd w:id="9"/>
+      <w:bookmarkEnd w:id="10"/>
     </w:p>
     <w:tbl>
       <w:tblPr>
@@ -17341,35 +17243,25 @@
           <w:lang w:eastAsia="tr-TR"/>
         </w:rPr>
       </w:pPr>
-      <w:bookmarkStart w:id="10" w:name="_Toc12497117"/>
+      <w:bookmarkStart w:id="11" w:name="_Toc12497117"/>
       <w:r>
         <w:t xml:space="preserve">Şekil </w:t>
       </w:r>
-      <w:r>
-        <w:fldChar w:fldCharType="begin"/>
-      </w:r>
-      <w:r>
-        <w:instrText xml:space="preserve"> SEQ Şekil \* ARABIC </w:instrText>
-      </w:r>
-      <w:r>
-        <w:fldChar w:fldCharType="separate"/>
-      </w:r>
-      <w:r>
-        <w:rPr>
-          <w:noProof/>
-        </w:rPr>
-        <w:t>4</w:t>
-      </w:r>
-      <w:r>
-        <w:fldChar w:fldCharType="end"/>
-      </w:r>
+      <w:fldSimple w:instr=" SEQ Şekil \* ARABIC ">
+        <w:r>
+          <w:rPr>
+            <w:noProof/>
+          </w:rPr>
+          <w:t>4</w:t>
+        </w:r>
+      </w:fldSimple>
       <w:r>
         <w:t xml:space="preserve">. </w:t>
       </w:r>
       <w:r>
         <w:t>Genel olarak tasarlanan modellerin birleştirilmiş hali olan ağ</w:t>
       </w:r>
-      <w:bookmarkEnd w:id="10"/>
+      <w:bookmarkEnd w:id="11"/>
     </w:p>
     <w:p>
       <w:pPr>
@@ -17606,37 +17498,27 @@
       <w:pPr>
         <w:pStyle w:val="Caption"/>
       </w:pPr>
-      <w:bookmarkStart w:id="11" w:name="_Ref12496129"/>
-      <w:bookmarkStart w:id="12" w:name="_Toc12497118"/>
+      <w:bookmarkStart w:id="12" w:name="_Ref12496129"/>
+      <w:bookmarkStart w:id="13" w:name="_Toc12497118"/>
       <w:r>
         <w:t xml:space="preserve">Şekil </w:t>
       </w:r>
-      <w:r>
-        <w:fldChar w:fldCharType="begin"/>
-      </w:r>
-      <w:r>
-        <w:instrText xml:space="preserve"> SEQ Şekil \* ARABIC </w:instrText>
-      </w:r>
-      <w:r>
-        <w:fldChar w:fldCharType="separate"/>
-      </w:r>
-      <w:r>
-        <w:rPr>
-          <w:noProof/>
-        </w:rPr>
-        <w:t>5</w:t>
-      </w:r>
-      <w:r>
-        <w:fldChar w:fldCharType="end"/>
-      </w:r>
-      <w:bookmarkEnd w:id="11"/>
+      <w:fldSimple w:instr=" SEQ Şekil \* ARABIC ">
+        <w:r>
+          <w:rPr>
+            <w:noProof/>
+          </w:rPr>
+          <w:t>5</w:t>
+        </w:r>
+      </w:fldSimple>
+      <w:bookmarkEnd w:id="12"/>
       <w:r>
         <w:t xml:space="preserve">. </w:t>
       </w:r>
       <w:r>
         <w:t>Önerilen modelin aşamaları</w:t>
       </w:r>
-      <w:bookmarkEnd w:id="12"/>
+      <w:bookmarkEnd w:id="13"/>
     </w:p>
     <w:p>
       <w:pPr>
@@ -18099,37 +17981,27 @@
         <w:pStyle w:val="Caption"/>
         <w:jc w:val="center"/>
       </w:pPr>
-      <w:bookmarkStart w:id="13" w:name="_Ref12496143"/>
-      <w:bookmarkStart w:id="14" w:name="_Toc12497119"/>
+      <w:bookmarkStart w:id="14" w:name="_Ref12496143"/>
+      <w:bookmarkStart w:id="15" w:name="_Toc12497119"/>
       <w:r>
         <w:t xml:space="preserve">Şekil </w:t>
       </w:r>
-      <w:r>
-        <w:fldChar w:fldCharType="begin"/>
-      </w:r>
-      <w:r>
-        <w:instrText xml:space="preserve"> SEQ Şekil \* ARABIC </w:instrText>
-      </w:r>
-      <w:r>
-        <w:fldChar w:fldCharType="separate"/>
-      </w:r>
-      <w:r>
-        <w:rPr>
-          <w:noProof/>
-        </w:rPr>
-        <w:t>6</w:t>
-      </w:r>
-      <w:r>
-        <w:fldChar w:fldCharType="end"/>
-      </w:r>
-      <w:bookmarkEnd w:id="13"/>
+      <w:fldSimple w:instr=" SEQ Şekil \* ARABIC ">
+        <w:r>
+          <w:rPr>
+            <w:noProof/>
+          </w:rPr>
+          <w:t>6</w:t>
+        </w:r>
+      </w:fldSimple>
+      <w:bookmarkEnd w:id="14"/>
       <w:r>
         <w:t xml:space="preserve">. </w:t>
       </w:r>
       <w:r>
         <w:t>Destek ve direnç çizgileri</w:t>
       </w:r>
-      <w:bookmarkEnd w:id="14"/>
+      <w:bookmarkEnd w:id="15"/>
     </w:p>
     <w:p>
       <w:r>
@@ -18204,35 +18076,25 @@
           <w:bCs/>
         </w:rPr>
       </w:pPr>
-      <w:bookmarkStart w:id="15" w:name="_Toc12497120"/>
+      <w:bookmarkStart w:id="16" w:name="_Toc12497120"/>
       <w:r>
         <w:t xml:space="preserve">Şekil </w:t>
       </w:r>
-      <w:r>
-        <w:fldChar w:fldCharType="begin"/>
-      </w:r>
-      <w:r>
-        <w:instrText xml:space="preserve"> SEQ Şekil \* ARABIC </w:instrText>
-      </w:r>
-      <w:r>
-        <w:fldChar w:fldCharType="separate"/>
-      </w:r>
-      <w:r>
-        <w:rPr>
-          <w:noProof/>
-        </w:rPr>
-        <w:t>7</w:t>
-      </w:r>
-      <w:r>
-        <w:fldChar w:fldCharType="end"/>
-      </w:r>
+      <w:fldSimple w:instr=" SEQ Şekil \* ARABIC ">
+        <w:r>
+          <w:rPr>
+            <w:noProof/>
+          </w:rPr>
+          <w:t>7</w:t>
+        </w:r>
+      </w:fldSimple>
       <w:r>
         <w:t xml:space="preserve">. </w:t>
       </w:r>
       <w:r>
         <w:t>Al ve sat noktaları</w:t>
       </w:r>
-      <w:bookmarkEnd w:id="15"/>
+      <w:bookmarkEnd w:id="16"/>
     </w:p>
     <w:p>
       <w:pPr>
@@ -18333,35 +18195,25 @@
         <w:pStyle w:val="Caption"/>
         <w:jc w:val="center"/>
       </w:pPr>
-      <w:bookmarkStart w:id="16" w:name="_Toc12497121"/>
+      <w:bookmarkStart w:id="17" w:name="_Toc12497121"/>
       <w:r>
         <w:t xml:space="preserve">Şekil </w:t>
       </w:r>
-      <w:r>
-        <w:fldChar w:fldCharType="begin"/>
-      </w:r>
-      <w:r>
-        <w:instrText xml:space="preserve"> SEQ Şekil \* ARABIC </w:instrText>
-      </w:r>
-      <w:r>
-        <w:fldChar w:fldCharType="separate"/>
-      </w:r>
-      <w:r>
-        <w:rPr>
-          <w:noProof/>
-        </w:rPr>
-        <w:t>8</w:t>
-      </w:r>
-      <w:r>
-        <w:fldChar w:fldCharType="end"/>
-      </w:r>
+      <w:fldSimple w:instr=" SEQ Şekil \* ARABIC ">
+        <w:r>
+          <w:rPr>
+            <w:noProof/>
+          </w:rPr>
+          <w:t>8</w:t>
+        </w:r>
+      </w:fldSimple>
       <w:r>
         <w:t xml:space="preserve">. </w:t>
       </w:r>
       <w:r>
         <w:t>Kullanılan Cuckoo Search Algoritması</w:t>
       </w:r>
-      <w:bookmarkEnd w:id="16"/>
+      <w:bookmarkEnd w:id="17"/>
     </w:p>
     <w:p>
       <w:pPr>
@@ -18698,35 +18550,25 @@
         <w:keepNext/>
         <w:jc w:val="center"/>
       </w:pPr>
-      <w:bookmarkStart w:id="17" w:name="_Toc12497231"/>
+      <w:bookmarkStart w:id="18" w:name="_Toc12497231"/>
       <w:r>
         <w:t xml:space="preserve">Tablo </w:t>
       </w:r>
-      <w:r>
-        <w:fldChar w:fldCharType="begin"/>
-      </w:r>
-      <w:r>
-        <w:instrText xml:space="preserve"> SEQ Tablo \* ARABIC </w:instrText>
-      </w:r>
-      <w:r>
-        <w:fldChar w:fldCharType="separate"/>
-      </w:r>
-      <w:r>
-        <w:rPr>
-          <w:noProof/>
-        </w:rPr>
-        <w:t>8</w:t>
-      </w:r>
-      <w:r>
-        <w:fldChar w:fldCharType="end"/>
-      </w:r>
+      <w:fldSimple w:instr=" SEQ Tablo \* ARABIC ">
+        <w:r>
+          <w:rPr>
+            <w:noProof/>
+          </w:rPr>
+          <w:t>8</w:t>
+        </w:r>
+      </w:fldSimple>
       <w:r>
         <w:t xml:space="preserve">. </w:t>
       </w:r>
       <w:r>
         <w:t>Evaluation of Proposal with different stock datas</w:t>
       </w:r>
-      <w:bookmarkEnd w:id="17"/>
+      <w:bookmarkEnd w:id="18"/>
     </w:p>
     <w:p>
       <w:pPr>
@@ -20013,7 +19855,7 @@
           <w:noProof/>
           <w:szCs w:val="20"/>
         </w:rPr>
-        <w:t>1</w:t>
+        <w:t>9</w:t>
       </w:r>
       <w:r>
         <w:rPr>
@@ -21415,9 +21257,9 @@
           <w:color w:val="000000"/>
         </w:rPr>
       </w:pPr>
-      <w:bookmarkStart w:id="18" w:name="_Ref12370181"/>
       <w:bookmarkStart w:id="19" w:name="_Ref12370070"/>
-      <w:bookmarkStart w:id="20" w:name="_Toc12497232"/>
+      <w:bookmarkStart w:id="20" w:name="_Ref12370181"/>
+      <w:bookmarkStart w:id="21" w:name="_Toc12497232"/>
       <w:r>
         <w:rPr>
           <w:rFonts w:cs="Times New Roman"/>
@@ -21462,8 +21304,8 @@
         </w:rPr>
         <w:t xml:space="preserve"> Ham veriseti</w:t>
       </w:r>
-      <w:bookmarkEnd w:id="18"/>
       <w:bookmarkEnd w:id="20"/>
+      <w:bookmarkEnd w:id="21"/>
     </w:p>
     <w:p>
       <w:pPr>
@@ -21722,30 +21564,20 @@
           <w:rFonts w:cs="Times New Roman"/>
         </w:rPr>
       </w:pPr>
-      <w:bookmarkStart w:id="21" w:name="_Ref12495519"/>
-      <w:bookmarkStart w:id="22" w:name="_Toc12497122"/>
+      <w:bookmarkStart w:id="22" w:name="_Ref12495519"/>
+      <w:bookmarkStart w:id="23" w:name="_Toc12497122"/>
       <w:r>
         <w:t xml:space="preserve">Şekil </w:t>
       </w:r>
-      <w:r>
-        <w:fldChar w:fldCharType="begin"/>
-      </w:r>
-      <w:r>
-        <w:instrText xml:space="preserve"> SEQ Şekil \* ARABIC </w:instrText>
-      </w:r>
-      <w:r>
-        <w:fldChar w:fldCharType="separate"/>
-      </w:r>
-      <w:r>
-        <w:rPr>
-          <w:noProof/>
-        </w:rPr>
-        <w:t>9</w:t>
-      </w:r>
-      <w:r>
-        <w:fldChar w:fldCharType="end"/>
-      </w:r>
-      <w:bookmarkEnd w:id="21"/>
+      <w:fldSimple w:instr=" SEQ Şekil \* ARABIC ">
+        <w:r>
+          <w:rPr>
+            <w:noProof/>
+          </w:rPr>
+          <w:t>9</w:t>
+        </w:r>
+      </w:fldSimple>
+      <w:bookmarkEnd w:id="22"/>
       <w:r>
         <w:t xml:space="preserve">. </w:t>
       </w:r>
@@ -21758,7 +21590,7 @@
         </w:rPr>
         <w:t>veriler arasında eşik değerden daha düşük volümlü olan opsiyonların oranı her noktanın sağ üst kısmına yazılmıştır)</w:t>
       </w:r>
-      <w:bookmarkEnd w:id="22"/>
+      <w:bookmarkEnd w:id="23"/>
     </w:p>
     <w:p>
       <w:pPr>
@@ -22109,7 +21941,7 @@
           <w:noProof/>
           <w:szCs w:val="20"/>
         </w:rPr>
-        <w:t>2'de</w:t>
+        <w:t>10</w:t>
       </w:r>
       <w:r>
         <w:rPr>
@@ -22585,7 +22417,7 @@
               </w:rPr>
               <w:fldChar w:fldCharType="separate"/>
             </w:r>
-            <w:bookmarkStart w:id="23" w:name="_Ref12377599"/>
+            <w:bookmarkStart w:id="24" w:name="_Ref12377599"/>
             <w:r>
               <w:rPr>
                 <w:rFonts w:cs="Times New Roman"/>
@@ -22594,7 +22426,7 @@
               </w:rPr>
               <w:t>1</w:t>
             </w:r>
-            <w:bookmarkEnd w:id="23"/>
+            <w:bookmarkEnd w:id="24"/>
             <w:r>
               <w:rPr>
                 <w:rFonts w:cs="Times New Roman"/>
@@ -22868,7 +22700,7 @@
               </w:rPr>
               <w:fldChar w:fldCharType="separate"/>
             </w:r>
-            <w:bookmarkStart w:id="24" w:name="_Ref12378138"/>
+            <w:bookmarkStart w:id="25" w:name="_Ref12378138"/>
             <w:r>
               <w:rPr>
                 <w:rFonts w:cs="Times New Roman"/>
@@ -22876,7 +22708,7 @@
               </w:rPr>
               <w:t>2</w:t>
             </w:r>
-            <w:bookmarkEnd w:id="24"/>
+            <w:bookmarkEnd w:id="25"/>
             <w:r>
               <w:rPr>
                 <w:rFonts w:cs="Times New Roman"/>
@@ -23246,7 +23078,7 @@
               </w:rPr>
               <w:fldChar w:fldCharType="separate"/>
             </w:r>
-            <w:bookmarkStart w:id="25" w:name="_Ref12378148"/>
+            <w:bookmarkStart w:id="26" w:name="_Ref12378148"/>
             <w:r>
               <w:rPr>
                 <w:rFonts w:cs="Times New Roman"/>
@@ -23254,7 +23086,7 @@
               </w:rPr>
               <w:t>3</w:t>
             </w:r>
-            <w:bookmarkEnd w:id="25"/>
+            <w:bookmarkEnd w:id="26"/>
             <w:r>
               <w:rPr>
                 <w:rFonts w:cs="Times New Roman"/>
@@ -23622,7 +23454,7 @@
               </w:rPr>
               <w:fldChar w:fldCharType="separate"/>
             </w:r>
-            <w:bookmarkStart w:id="26" w:name="_Ref12378158"/>
+            <w:bookmarkStart w:id="27" w:name="_Ref12378158"/>
             <w:r>
               <w:rPr>
                 <w:rFonts w:cs="Times New Roman"/>
@@ -23630,7 +23462,7 @@
               </w:rPr>
               <w:t>4</w:t>
             </w:r>
-            <w:bookmarkEnd w:id="26"/>
+            <w:bookmarkEnd w:id="27"/>
             <w:r>
               <w:rPr>
                 <w:rFonts w:cs="Times New Roman"/>
@@ -24238,8 +24070,8 @@
           <w:color w:val="000000"/>
         </w:rPr>
       </w:pPr>
-      <w:bookmarkStart w:id="27" w:name="_Ref12372210"/>
-      <w:bookmarkStart w:id="28" w:name="_Toc12497233"/>
+      <w:bookmarkStart w:id="28" w:name="_Ref12372210"/>
+      <w:bookmarkStart w:id="29" w:name="_Toc12497233"/>
       <w:r>
         <w:rPr>
           <w:rFonts w:cs="Times New Roman"/>
@@ -24283,8 +24115,8 @@
         </w:rPr>
         <w:t xml:space="preserve"> BS formülünde kullanılan parametreler</w:t>
       </w:r>
-      <w:bookmarkEnd w:id="27"/>
       <w:bookmarkEnd w:id="28"/>
+      <w:bookmarkEnd w:id="29"/>
     </w:p>
     <w:p>
       <w:pPr>
@@ -25919,9 +25751,9 @@
           <w:color w:val="000000"/>
         </w:rPr>
       </w:pPr>
-      <w:bookmarkStart w:id="29" w:name="_Ref12372487"/>
       <w:bookmarkStart w:id="30" w:name="_Ref12372491"/>
-      <w:bookmarkStart w:id="31" w:name="_Toc12497234"/>
+      <w:bookmarkStart w:id="31" w:name="_Ref12372487"/>
+      <w:bookmarkStart w:id="32" w:name="_Toc12497234"/>
       <w:r>
         <w:rPr>
           <w:rFonts w:cs="Times New Roman"/>
@@ -25972,8 +25804,8 @@
         </w:rPr>
         <w:t>Revize edilmiş veri seti</w:t>
       </w:r>
-      <w:bookmarkEnd w:id="29"/>
       <w:bookmarkEnd w:id="31"/>
+      <w:bookmarkEnd w:id="32"/>
     </w:p>
     <w:p>
       <w:pPr>
@@ -26107,152 +25939,142 @@
         <w:pStyle w:val="Caption"/>
         <w:jc w:val="center"/>
       </w:pPr>
-      <w:bookmarkStart w:id="32" w:name="_Ref12495555"/>
-      <w:bookmarkStart w:id="33" w:name="_Toc12497123"/>
+      <w:bookmarkStart w:id="33" w:name="_Ref12495555"/>
+      <w:bookmarkStart w:id="34" w:name="_Toc12497123"/>
       <w:r>
         <w:t xml:space="preserve">Şekil </w:t>
       </w:r>
-      <w:r>
+      <w:fldSimple w:instr=" SEQ Şekil \* ARABIC ">
+        <w:r>
+          <w:rPr>
+            <w:noProof/>
+          </w:rPr>
+          <w:t>10</w:t>
+        </w:r>
+      </w:fldSimple>
+      <w:bookmarkEnd w:id="33"/>
+      <w:r>
+        <w:t xml:space="preserve">. </w:t>
+      </w:r>
+      <w:r>
+        <w:t>BS hata histogramı</w:t>
+      </w:r>
+      <w:bookmarkEnd w:id="34"/>
+    </w:p>
+    <w:p>
+      <w:pPr>
+        <w:rPr>
+          <w:color w:val="000000"/>
+          <w:szCs w:val="20"/>
+        </w:rPr>
+      </w:pPr>
+    </w:p>
+    <w:p>
+      <w:pPr>
+        <w:rPr>
+          <w:color w:val="000000"/>
+          <w:szCs w:val="20"/>
+        </w:rPr>
+      </w:pPr>
+      <w:r>
+        <w:rPr>
+          <w:color w:val="000000"/>
+          <w:szCs w:val="20"/>
+        </w:rPr>
+        <w:t>Yapılan bu ön hazırlıklardan sonra opsiyonel fiyat tahmini için 1 tek aşamalı ve 4 çok aşamalı olmak üzere 5 farklı statik, YSA temelli yaklaşım oluşturulmuş ve karşılaştırılmıştır. Daha sonra en iyi tasarım, dinamik modüler tasarıma dönüştürülerek doğrusal optimizasyon algoritması kullanılarak optimize edilmiştir. Bu modellerin detayları alt başlıklarda verilmiştir.</w:t>
+      </w:r>
+    </w:p>
+    <w:p>
+      <w:pPr>
+        <w:rPr>
+          <w:color w:val="000000"/>
+          <w:szCs w:val="20"/>
+        </w:rPr>
+      </w:pPr>
+    </w:p>
+    <w:p>
+      <w:pPr>
+        <w:rPr>
+          <w:color w:val="000000"/>
+          <w:szCs w:val="20"/>
+        </w:rPr>
+      </w:pPr>
+      <w:r>
+        <w:rPr>
+          <w:color w:val="000000"/>
+          <w:szCs w:val="20"/>
+        </w:rPr>
+        <w:t>Model geliştirme ve performans analizi sırasında, BS hesaplamasından sonra veriler (05.2009 - 09.2009 arası) günlük olarak \% 80  eğitim ve \% 20 test olmak üzere iki bölüme ayrılmıştır.</w:t>
+      </w:r>
+    </w:p>
+    <w:p>
+      <w:pPr>
+        <w:rPr>
+          <w:color w:val="000000"/>
+          <w:szCs w:val="20"/>
+        </w:rPr>
+      </w:pPr>
+    </w:p>
+    <w:p>
+      <w:pPr>
+        <w:rPr>
+          <w:color w:val="000000"/>
+          <w:szCs w:val="20"/>
+        </w:rPr>
+      </w:pPr>
+      <w:r>
+        <w:rPr>
+          <w:color w:val="000000"/>
+          <w:szCs w:val="20"/>
+        </w:rPr>
+        <w:t xml:space="preserve">Tüm yapılarda, öznitelikler </w:t>
+      </w:r>
+      <w:r>
+        <w:rPr>
+          <w:color w:val="000000"/>
+          <w:szCs w:val="20"/>
+        </w:rPr>
         <w:fldChar w:fldCharType="begin"/>
       </w:r>
       <w:r>
-        <w:instrText xml:space="preserve"> SEQ Şekil \* ARABIC </w:instrText>
-      </w:r>
-      <w:r>
+        <w:rPr>
+          <w:color w:val="000000"/>
+          <w:szCs w:val="20"/>
+        </w:rPr>
+        <w:instrText xml:space="preserve"> REF _Ref12373084 \h </w:instrText>
+      </w:r>
+      <w:r>
+        <w:rPr>
+          <w:color w:val="000000"/>
+          <w:szCs w:val="20"/>
+        </w:rPr>
+        <w:instrText xml:space="preserve"> \* MERGEFORMAT </w:instrText>
+      </w:r>
+      <w:r>
+        <w:rPr>
+          <w:color w:val="000000"/>
+          <w:szCs w:val="20"/>
+        </w:rPr>
+      </w:r>
+      <w:r>
+        <w:rPr>
+          <w:color w:val="000000"/>
+          <w:szCs w:val="20"/>
+        </w:rPr>
         <w:fldChar w:fldCharType="separate"/>
       </w:r>
       <w:r>
         <w:rPr>
+          <w:szCs w:val="20"/>
+        </w:rPr>
+        <w:t xml:space="preserve">Tablo </w:t>
+      </w:r>
+      <w:r>
+        <w:rPr>
           <w:noProof/>
-        </w:rPr>
-        <w:t>10</w:t>
-      </w:r>
-      <w:r>
-        <w:fldChar w:fldCharType="end"/>
-      </w:r>
-      <w:bookmarkEnd w:id="32"/>
-      <w:r>
-        <w:t xml:space="preserve">. </w:t>
-      </w:r>
-      <w:r>
-        <w:t>BS hata histogramı</w:t>
-      </w:r>
-      <w:bookmarkEnd w:id="33"/>
-    </w:p>
-    <w:p>
-      <w:pPr>
-        <w:rPr>
-          <w:color w:val="000000"/>
-          <w:szCs w:val="20"/>
-        </w:rPr>
-      </w:pPr>
-    </w:p>
-    <w:p>
-      <w:pPr>
-        <w:rPr>
-          <w:color w:val="000000"/>
-          <w:szCs w:val="20"/>
-        </w:rPr>
-      </w:pPr>
-      <w:r>
-        <w:rPr>
-          <w:color w:val="000000"/>
-          <w:szCs w:val="20"/>
-        </w:rPr>
-        <w:t>Yapılan bu ön hazırlıklardan sonra opsiyonel fiyat tahmini için 1 tek aşamalı ve 4 çok aşamalı olmak üzere 5 farklı statik, YSA temelli yaklaşım oluşturulmuş ve karşılaştırılmıştır. Daha sonra en iyi tasarım, dinamik modüler tasarıma dönüştürülerek doğrusal optimizasyon algoritması kullanılarak optimize edilmiştir. Bu modellerin detayları alt başlıklarda verilmiştir.</w:t>
-      </w:r>
-    </w:p>
-    <w:p>
-      <w:pPr>
-        <w:rPr>
-          <w:color w:val="000000"/>
-          <w:szCs w:val="20"/>
-        </w:rPr>
-      </w:pPr>
-    </w:p>
-    <w:p>
-      <w:pPr>
-        <w:rPr>
-          <w:color w:val="000000"/>
-          <w:szCs w:val="20"/>
-        </w:rPr>
-      </w:pPr>
-      <w:r>
-        <w:rPr>
-          <w:color w:val="000000"/>
-          <w:szCs w:val="20"/>
-        </w:rPr>
-        <w:t>Model geliştirme ve performans analizi sırasında, BS hesaplamasından sonra veriler (05.2009 - 09.2009 arası) günlük olarak \% 80  eğitim ve \% 20 test olmak üzere iki bölüme ayrılmıştır.</w:t>
-      </w:r>
-    </w:p>
-    <w:p>
-      <w:pPr>
-        <w:rPr>
-          <w:color w:val="000000"/>
-          <w:szCs w:val="20"/>
-        </w:rPr>
-      </w:pPr>
-    </w:p>
-    <w:p>
-      <w:pPr>
-        <w:rPr>
-          <w:color w:val="000000"/>
-          <w:szCs w:val="20"/>
-        </w:rPr>
-      </w:pPr>
-      <w:r>
-        <w:rPr>
-          <w:color w:val="000000"/>
-          <w:szCs w:val="20"/>
-        </w:rPr>
-        <w:t xml:space="preserve">Tüm yapılarda, öznitelikler </w:t>
-      </w:r>
-      <w:r>
-        <w:rPr>
-          <w:color w:val="000000"/>
-          <w:szCs w:val="20"/>
-        </w:rPr>
-        <w:fldChar w:fldCharType="begin"/>
-      </w:r>
-      <w:r>
-        <w:rPr>
-          <w:color w:val="000000"/>
-          <w:szCs w:val="20"/>
-        </w:rPr>
-        <w:instrText xml:space="preserve"> REF _Ref12373084 \h </w:instrText>
-      </w:r>
-      <w:r>
-        <w:rPr>
-          <w:color w:val="000000"/>
-          <w:szCs w:val="20"/>
-        </w:rPr>
-        <w:instrText xml:space="preserve"> \* MERGEFORMAT </w:instrText>
-      </w:r>
-      <w:r>
-        <w:rPr>
-          <w:color w:val="000000"/>
-          <w:szCs w:val="20"/>
-        </w:rPr>
-      </w:r>
-      <w:r>
-        <w:rPr>
-          <w:color w:val="000000"/>
-          <w:szCs w:val="20"/>
-        </w:rPr>
-        <w:fldChar w:fldCharType="separate"/>
-      </w:r>
-      <w:r>
-        <w:rPr>
-          <w:szCs w:val="20"/>
-        </w:rPr>
-        <w:t xml:space="preserve">Tablo </w:t>
-      </w:r>
-      <w:r>
-        <w:rPr>
-          <w:noProof/>
-          <w:szCs w:val="20"/>
-        </w:rPr>
-        <w:t>4</w:t>
+          <w:szCs w:val="20"/>
+        </w:rPr>
+        <w:t>12</w:t>
       </w:r>
       <w:r>
         <w:rPr>
@@ -26988,9 +26810,9 @@
           <w:color w:val="000000"/>
         </w:rPr>
       </w:pPr>
-      <w:bookmarkStart w:id="34" w:name="_Ref12375498"/>
       <w:bookmarkStart w:id="35" w:name="_Ref12373084"/>
-      <w:bookmarkStart w:id="36" w:name="_Toc12497235"/>
+      <w:bookmarkStart w:id="36" w:name="_Ref12375498"/>
+      <w:bookmarkStart w:id="37" w:name="_Toc12497235"/>
       <w:r>
         <w:rPr>
           <w:rFonts w:cs="Times New Roman"/>
@@ -27035,8 +26857,8 @@
         </w:rPr>
         <w:t xml:space="preserve"> Öznitelikler</w:t>
       </w:r>
-      <w:bookmarkEnd w:id="34"/>
       <w:bookmarkEnd w:id="36"/>
+      <w:bookmarkEnd w:id="37"/>
     </w:p>
     <w:p>
       <w:pPr>
@@ -27365,37 +27187,27 @@
         <w:pStyle w:val="Caption"/>
         <w:jc w:val="center"/>
       </w:pPr>
-      <w:bookmarkStart w:id="37" w:name="_Ref12495662"/>
-      <w:bookmarkStart w:id="38" w:name="_Toc12497124"/>
+      <w:bookmarkStart w:id="38" w:name="_Ref12495662"/>
+      <w:bookmarkStart w:id="39" w:name="_Toc12497124"/>
       <w:r>
         <w:t xml:space="preserve">Şekil </w:t>
       </w:r>
-      <w:r>
-        <w:fldChar w:fldCharType="begin"/>
-      </w:r>
-      <w:r>
-        <w:instrText xml:space="preserve"> SEQ Şekil \* ARABIC </w:instrText>
-      </w:r>
-      <w:r>
-        <w:fldChar w:fldCharType="separate"/>
-      </w:r>
-      <w:r>
-        <w:rPr>
-          <w:noProof/>
-        </w:rPr>
-        <w:t>11</w:t>
-      </w:r>
-      <w:r>
-        <w:fldChar w:fldCharType="end"/>
-      </w:r>
-      <w:bookmarkEnd w:id="37"/>
+      <w:fldSimple w:instr=" SEQ Şekil \* ARABIC ">
+        <w:r>
+          <w:rPr>
+            <w:noProof/>
+          </w:rPr>
+          <w:t>11</w:t>
+        </w:r>
+      </w:fldSimple>
+      <w:bookmarkEnd w:id="38"/>
       <w:r>
         <w:t xml:space="preserve">. </w:t>
       </w:r>
       <w:r>
         <w:t>BS ve modellerin ortalama hata ve hata varyansı (her biri 25 farklı doğrulama için)</w:t>
       </w:r>
-      <w:bookmarkEnd w:id="38"/>
+      <w:bookmarkEnd w:id="39"/>
     </w:p>
     <w:p>
       <w:pPr>
@@ -28686,8 +28498,8 @@
           <w:color w:val="000000"/>
         </w:rPr>
       </w:pPr>
-      <w:bookmarkStart w:id="39" w:name="_Ref12373591"/>
-      <w:bookmarkStart w:id="40" w:name="_Toc12497236"/>
+      <w:bookmarkStart w:id="40" w:name="_Ref12373591"/>
+      <w:bookmarkStart w:id="41" w:name="_Toc12497236"/>
       <w:r>
         <w:rPr>
           <w:rFonts w:cs="Times New Roman"/>
@@ -28725,7 +28537,7 @@
         </w:rPr>
         <w:fldChar w:fldCharType="end"/>
       </w:r>
-      <w:bookmarkEnd w:id="39"/>
+      <w:bookmarkEnd w:id="40"/>
       <w:r>
         <w:rPr>
           <w:rFonts w:cs="Times New Roman"/>
@@ -29229,7 +29041,7 @@
         </w:rPr>
         <w:t>ansı)</w:t>
       </w:r>
-      <w:bookmarkEnd w:id="40"/>
+      <w:bookmarkEnd w:id="41"/>
     </w:p>
     <w:p>
       <w:pPr>
@@ -29649,30 +29461,20 @@
         <w:pStyle w:val="Caption"/>
         <w:jc w:val="center"/>
       </w:pPr>
-      <w:bookmarkStart w:id="41" w:name="_Ref12495761"/>
-      <w:bookmarkStart w:id="42" w:name="_Toc12497125"/>
+      <w:bookmarkStart w:id="42" w:name="_Ref12495761"/>
+      <w:bookmarkStart w:id="43" w:name="_Toc12497125"/>
       <w:r>
         <w:t xml:space="preserve">Şekil </w:t>
       </w:r>
-      <w:r>
-        <w:fldChar w:fldCharType="begin"/>
-      </w:r>
-      <w:r>
-        <w:instrText xml:space="preserve"> SEQ Şekil \* ARABIC </w:instrText>
-      </w:r>
-      <w:r>
-        <w:fldChar w:fldCharType="separate"/>
-      </w:r>
-      <w:r>
-        <w:rPr>
-          <w:noProof/>
-        </w:rPr>
-        <w:t>12</w:t>
-      </w:r>
-      <w:r>
-        <w:fldChar w:fldCharType="end"/>
-      </w:r>
-      <w:bookmarkEnd w:id="41"/>
+      <w:fldSimple w:instr=" SEQ Şekil \* ARABIC ">
+        <w:r>
+          <w:rPr>
+            <w:noProof/>
+          </w:rPr>
+          <w:t>12</w:t>
+        </w:r>
+      </w:fldSimple>
+      <w:bookmarkEnd w:id="42"/>
       <w:r>
         <w:t xml:space="preserve">. </w:t>
       </w:r>
@@ -29685,7 +29487,7 @@
         </w:rPr>
         <w:t>.Üçgenlerin ilgili eşik değeri ile oluşturduğu bölgedeki opsiyonların tüm opsiyonlara oranı yanlarında verilmiştir.)</w:t>
       </w:r>
-      <w:bookmarkEnd w:id="42"/>
+      <w:bookmarkEnd w:id="43"/>
     </w:p>
     <w:p>
       <w:pPr>
@@ -29754,59 +29556,160 @@
         <w:pStyle w:val="Caption"/>
         <w:jc w:val="center"/>
       </w:pPr>
-      <w:bookmarkStart w:id="43" w:name="_Ref12495771"/>
-      <w:bookmarkStart w:id="44" w:name="_Toc12497126"/>
+      <w:bookmarkStart w:id="44" w:name="_Ref12495771"/>
+      <w:bookmarkStart w:id="45" w:name="_Toc12497126"/>
       <w:r>
         <w:t xml:space="preserve">Şekil </w:t>
       </w:r>
-      <w:r>
+      <w:fldSimple w:instr=" SEQ Şekil \* ARABIC ">
+        <w:r>
+          <w:rPr>
+            <w:noProof/>
+          </w:rPr>
+          <w:t>13</w:t>
+        </w:r>
+      </w:fldSimple>
+      <w:bookmarkEnd w:id="44"/>
+      <w:r>
+        <w:t xml:space="preserve">. </w:t>
+      </w:r>
+      <w:r>
+        <w:t>VS-BS/MLP dizaynı</w:t>
+      </w:r>
+      <w:bookmarkEnd w:id="45"/>
+    </w:p>
+    <w:p>
+      <w:pPr>
+        <w:rPr>
+          <w:color w:val="000000"/>
+          <w:szCs w:val="20"/>
+        </w:rPr>
+      </w:pPr>
+    </w:p>
+    <w:p>
+      <w:pPr>
+        <w:rPr>
+          <w:color w:val="000000"/>
+          <w:szCs w:val="20"/>
+        </w:rPr>
+      </w:pPr>
+      <w:r>
+        <w:rPr>
+          <w:color w:val="000000"/>
+          <w:szCs w:val="20"/>
+        </w:rPr>
+        <w:t>Yine, 25 farklı doğrulama setiyle, ortalamanın ortalama, varyans çifti (0.84686, 0.00003) olarak ve varyansın ortalama, varyans çifti (7.93791, 0.00012) olarak elde edilmiştir (</w:t>
+      </w:r>
+      <w:r>
+        <w:rPr>
+          <w:color w:val="000000"/>
+          <w:szCs w:val="20"/>
+        </w:rPr>
         <w:fldChar w:fldCharType="begin"/>
       </w:r>
       <w:r>
-        <w:instrText xml:space="preserve"> SEQ Şekil \* ARABIC </w:instrText>
-      </w:r>
-      <w:r>
+        <w:rPr>
+          <w:color w:val="000000"/>
+          <w:szCs w:val="20"/>
+        </w:rPr>
+        <w:instrText xml:space="preserve"> REF _Ref12495662 \h </w:instrText>
+      </w:r>
+      <w:r>
+        <w:rPr>
+          <w:color w:val="000000"/>
+          <w:szCs w:val="20"/>
+        </w:rPr>
+      </w:r>
+      <w:r>
+        <w:rPr>
+          <w:color w:val="000000"/>
+          <w:szCs w:val="20"/>
+        </w:rPr>
         <w:fldChar w:fldCharType="separate"/>
       </w:r>
       <w:r>
+        <w:t xml:space="preserve">Şekil </w:t>
+      </w:r>
+      <w:r>
         <w:rPr>
           <w:noProof/>
         </w:rPr>
-        <w:t>13</w:t>
-      </w:r>
-      <w:r>
+        <w:t>11</w:t>
+      </w:r>
+      <w:r>
+        <w:rPr>
+          <w:color w:val="000000"/>
+          <w:szCs w:val="20"/>
+        </w:rPr>
         <w:fldChar w:fldCharType="end"/>
       </w:r>
-      <w:bookmarkEnd w:id="43"/>
-      <w:r>
-        <w:t xml:space="preserve">. </w:t>
-      </w:r>
-      <w:r>
-        <w:t>VS-BS/MLP dizaynı</w:t>
-      </w:r>
-      <w:bookmarkEnd w:id="44"/>
-    </w:p>
-    <w:p>
-      <w:pPr>
-        <w:rPr>
-          <w:color w:val="000000"/>
-          <w:szCs w:val="20"/>
-        </w:rPr>
-      </w:pPr>
-    </w:p>
-    <w:p>
-      <w:pPr>
-        <w:rPr>
-          <w:color w:val="000000"/>
-          <w:szCs w:val="20"/>
-        </w:rPr>
-      </w:pPr>
-      <w:r>
-        <w:rPr>
-          <w:color w:val="000000"/>
-          <w:szCs w:val="20"/>
-        </w:rPr>
-        <w:t>Yine, 25 farklı doğrulama setiyle, ortalamanın ortalama, varyans çifti (0.84686, 0.00003) olarak ve varyansın ortalama, varyans çifti (7.93791, 0.00012) olarak elde edilmiştir (</w:t>
+      <w:r>
+        <w:rPr>
+          <w:color w:val="000000"/>
+          <w:szCs w:val="20"/>
+        </w:rPr>
+        <w:t>). Sonuçlar, sonucun tek başına BS formülünü kullanmaktan daha iyi olduğunu, ancak tek aşamalı YSA tahmininden daha kötü olduğunu göstermektedir. Bunun nedeni, uzak bölgede, opsiyonların işlem hacimlerinin daha az olması nedeniyle fiyat değerlerinin makul değerleri yansıtmadan aşırı derecede değişme gösterdiğinden olabilir. Bu durumda, YSA öğrenme süreci bir model oluşturmakta güçlük çekmektedir.</w:t>
+      </w:r>
+    </w:p>
+    <w:p>
+      <w:pPr>
+        <w:rPr>
+          <w:color w:val="000000"/>
+          <w:szCs w:val="20"/>
+        </w:rPr>
+      </w:pPr>
+    </w:p>
+    <w:p>
+      <w:pPr>
+        <w:rPr>
+          <w:color w:val="000000"/>
+          <w:szCs w:val="20"/>
+        </w:rPr>
+      </w:pPr>
+    </w:p>
+    <w:p>
+      <w:pPr>
+        <w:rPr>
+          <w:color w:val="000000"/>
+          <w:szCs w:val="20"/>
+        </w:rPr>
+      </w:pPr>
+    </w:p>
+    <w:p>
+      <w:pPr>
+        <w:pStyle w:val="Heading5"/>
+        <w:rPr>
+          <w:szCs w:val="20"/>
+        </w:rPr>
+      </w:pPr>
+      <w:r>
+        <w:rPr>
+          <w:szCs w:val="20"/>
+        </w:rPr>
+        <w:t>VS-MLP/MLP</w:t>
+      </w:r>
+    </w:p>
+    <w:p>
+      <w:pPr>
+        <w:rPr>
+          <w:color w:val="000000"/>
+          <w:szCs w:val="20"/>
+        </w:rPr>
+      </w:pPr>
+    </w:p>
+    <w:p>
+      <w:pPr>
+        <w:rPr>
+          <w:color w:val="000000"/>
+          <w:szCs w:val="20"/>
+        </w:rPr>
+      </w:pPr>
+      <w:r>
+        <w:rPr>
+          <w:color w:val="000000"/>
+          <w:szCs w:val="20"/>
+        </w:rPr>
+        <w:t xml:space="preserve">Bu yaklaşımla VS-BS / MLP modeline benzer bir yapı oluşturulmuştur. Tek fark, bölgelerin iki tarafının da </w:t>
       </w:r>
       <w:r>
         <w:rPr>
@@ -29820,13 +29723,7 @@
           <w:color w:val="000000"/>
           <w:szCs w:val="20"/>
         </w:rPr>
-        <w:instrText xml:space="preserve"> REF _Ref12495662 \h </w:instrText>
-      </w:r>
-      <w:r>
-        <w:rPr>
-          <w:color w:val="000000"/>
-          <w:szCs w:val="20"/>
-        </w:rPr>
+        <w:instrText xml:space="preserve"> REF _Ref12375040 \h  \* MERGEFORMAT </w:instrText>
       </w:r>
       <w:r>
         <w:rPr>
@@ -29836,161 +29733,14 @@
         <w:fldChar w:fldCharType="separate"/>
       </w:r>
       <w:r>
-        <w:t xml:space="preserve">Şekil </w:t>
-      </w:r>
-      <w:r>
-        <w:rPr>
-          <w:noProof/>
-        </w:rPr>
-        <w:t>11</w:t>
-      </w:r>
-      <w:r>
-        <w:rPr>
-          <w:color w:val="000000"/>
-          <w:szCs w:val="20"/>
-        </w:rPr>
-        <w:fldChar w:fldCharType="end"/>
-      </w:r>
-      <w:r>
-        <w:rPr>
-          <w:color w:val="000000"/>
-          <w:szCs w:val="20"/>
-        </w:rPr>
-        <w:t>). Sonuçlar, sonucun tek başına BS formülünü kullanmaktan daha iyi olduğunu, ancak tek aşamalı YSA tahmininden daha kötü olduğunu göstermektedir. Bunun nedeni, uzak bölgede, opsiyonların işlem hacimlerinin daha az olması nedeniyle fiyat değerlerinin makul değerleri yansıtmadan aşırı derecede değişme gösterdiğinden olabilir. Bu durumda, YSA öğrenme süreci bir model oluşturmakta güçlük çekmektedir.</w:t>
-      </w:r>
-    </w:p>
-    <w:p>
-      <w:pPr>
-        <w:rPr>
-          <w:color w:val="000000"/>
-          <w:szCs w:val="20"/>
-        </w:rPr>
-      </w:pPr>
-    </w:p>
-    <w:p>
-      <w:pPr>
-        <w:rPr>
-          <w:color w:val="000000"/>
-          <w:szCs w:val="20"/>
-        </w:rPr>
-      </w:pPr>
-    </w:p>
-    <w:p>
-      <w:pPr>
-        <w:rPr>
-          <w:color w:val="000000"/>
-          <w:szCs w:val="20"/>
-        </w:rPr>
-      </w:pPr>
-    </w:p>
-    <w:p>
-      <w:pPr>
-        <w:pStyle w:val="Heading5"/>
-        <w:rPr>
-          <w:szCs w:val="20"/>
-        </w:rPr>
-      </w:pPr>
-      <w:r>
-        <w:rPr>
-          <w:szCs w:val="20"/>
-        </w:rPr>
-        <w:t>VS-MLP/MLP</w:t>
-      </w:r>
-    </w:p>
-    <w:p>
-      <w:pPr>
-        <w:rPr>
-          <w:color w:val="000000"/>
-          <w:szCs w:val="20"/>
-        </w:rPr>
-      </w:pPr>
-    </w:p>
-    <w:p>
-      <w:pPr>
-        <w:rPr>
-          <w:color w:val="000000"/>
-          <w:szCs w:val="20"/>
-        </w:rPr>
-      </w:pPr>
-      <w:r>
-        <w:rPr>
-          <w:color w:val="000000"/>
-          <w:szCs w:val="20"/>
-        </w:rPr>
-        <w:t xml:space="preserve">Bu yaklaşımla VS-BS / MLP modeline benzer bir yapı oluşturulmuştur. Tek fark, bölgelerin iki tarafının da </w:t>
-      </w:r>
-      <w:r>
-        <w:rPr>
-          <w:color w:val="000000"/>
-          <w:szCs w:val="20"/>
-        </w:rPr>
-        <w:fldChar w:fldCharType="begin"/>
-      </w:r>
-      <w:r>
-        <w:rPr>
-          <w:color w:val="000000"/>
-          <w:szCs w:val="20"/>
-        </w:rPr>
-        <w:instrText xml:space="preserve"> REF _Ref12375040 \h  \* MERGEFORMAT </w:instrText>
-      </w:r>
-      <w:r>
-        <w:rPr>
-          <w:color w:val="000000"/>
-          <w:szCs w:val="20"/>
-        </w:rPr>
-      </w:r>
-      <w:r>
-        <w:rPr>
-          <w:color w:val="000000"/>
-          <w:szCs w:val="20"/>
-        </w:rPr>
-        <w:fldChar w:fldCharType="separate"/>
-      </w:r>
-      <w:r>
-        <w:rPr>
-          <w:szCs w:val="20"/>
-        </w:rPr>
-        <w:fldChar w:fldCharType="begin"/>
-      </w:r>
-      <w:r>
-        <w:rPr>
-          <w:color w:val="000000"/>
-          <w:szCs w:val="20"/>
-        </w:rPr>
-        <w:instrText xml:space="preserve"> REF _Ref12495804 \h </w:instrText>
-      </w:r>
-      <w:r>
-        <w:rPr>
-          <w:szCs w:val="20"/>
-        </w:rPr>
-      </w:r>
-      <w:r>
-        <w:rPr>
-          <w:szCs w:val="20"/>
-        </w:rPr>
-        <w:fldChar w:fldCharType="separate"/>
-      </w:r>
-      <w:r>
-        <w:t xml:space="preserve">Şekil </w:t>
-      </w:r>
-      <w:r>
-        <w:rPr>
-          <w:noProof/>
-        </w:rPr>
-        <w:t>14</w:t>
-      </w:r>
-      <w:r>
-        <w:rPr>
-          <w:szCs w:val="20"/>
-        </w:rPr>
-        <w:fldChar w:fldCharType="end"/>
-      </w:r>
-      <w:r>
-        <w:rPr>
-          <w:noProof/>
-          <w:szCs w:val="20"/>
-        </w:rPr>
-        <w:t>6</w:t>
+        <w:rPr>
+          <w:b/>
+          <w:bCs/>
+          <w:color w:val="000000"/>
+          <w:szCs w:val="20"/>
+          <w:lang w:val="en-US"/>
+        </w:rPr>
+        <w:t>Error! Reference source not found.</w:t>
       </w:r>
       <w:r>
         <w:rPr>
@@ -30081,37 +29831,27 @@
         <w:pStyle w:val="Caption"/>
         <w:jc w:val="center"/>
       </w:pPr>
-      <w:bookmarkStart w:id="45" w:name="_Ref12495804"/>
-      <w:bookmarkStart w:id="46" w:name="_Toc12497127"/>
+      <w:bookmarkStart w:id="46" w:name="_Ref12495804"/>
+      <w:bookmarkStart w:id="47" w:name="_Toc12497127"/>
       <w:r>
         <w:t xml:space="preserve">Şekil </w:t>
       </w:r>
-      <w:r>
-        <w:fldChar w:fldCharType="begin"/>
-      </w:r>
-      <w:r>
-        <w:instrText xml:space="preserve"> SEQ Şekil \* ARABIC </w:instrText>
-      </w:r>
-      <w:r>
-        <w:fldChar w:fldCharType="separate"/>
-      </w:r>
-      <w:r>
-        <w:rPr>
-          <w:noProof/>
-        </w:rPr>
-        <w:t>14</w:t>
-      </w:r>
-      <w:r>
-        <w:fldChar w:fldCharType="end"/>
-      </w:r>
-      <w:bookmarkEnd w:id="45"/>
+      <w:fldSimple w:instr=" SEQ Şekil \* ARABIC ">
+        <w:r>
+          <w:rPr>
+            <w:noProof/>
+          </w:rPr>
+          <w:t>14</w:t>
+        </w:r>
+      </w:fldSimple>
+      <w:bookmarkEnd w:id="46"/>
       <w:r>
         <w:t xml:space="preserve">. </w:t>
       </w:r>
       <w:r>
         <w:t>VS-MLP/MLP dizaynı</w:t>
       </w:r>
-      <w:bookmarkEnd w:id="46"/>
+      <w:bookmarkEnd w:id="47"/>
     </w:p>
     <w:p>
       <w:pPr>
@@ -30355,37 +30095,27 @@
         <w:pStyle w:val="Caption"/>
         <w:jc w:val="center"/>
       </w:pPr>
-      <w:bookmarkStart w:id="47" w:name="_Ref12495823"/>
-      <w:bookmarkStart w:id="48" w:name="_Toc12497128"/>
+      <w:bookmarkStart w:id="48" w:name="_Ref12495823"/>
+      <w:bookmarkStart w:id="49" w:name="_Toc12497128"/>
       <w:r>
         <w:t xml:space="preserve">Şekil </w:t>
       </w:r>
-      <w:r>
-        <w:fldChar w:fldCharType="begin"/>
-      </w:r>
-      <w:r>
-        <w:instrText xml:space="preserve"> SEQ Şekil \* ARABIC </w:instrText>
-      </w:r>
-      <w:r>
-        <w:fldChar w:fldCharType="separate"/>
-      </w:r>
-      <w:r>
-        <w:rPr>
-          <w:noProof/>
-        </w:rPr>
-        <w:t>15</w:t>
-      </w:r>
-      <w:r>
-        <w:fldChar w:fldCharType="end"/>
-      </w:r>
-      <w:bookmarkEnd w:id="47"/>
+      <w:fldSimple w:instr=" SEQ Şekil \* ARABIC ">
+        <w:r>
+          <w:rPr>
+            <w:noProof/>
+          </w:rPr>
+          <w:t>15</w:t>
+        </w:r>
+      </w:fldSimple>
+      <w:bookmarkEnd w:id="48"/>
       <w:r>
         <w:t xml:space="preserve">. </w:t>
       </w:r>
       <w:r>
         <w:t>C-BS/MLP design</w:t>
       </w:r>
-      <w:bookmarkEnd w:id="48"/>
+      <w:bookmarkEnd w:id="49"/>
     </w:p>
     <w:p>
       <w:pPr>
@@ -30563,37 +30293,27 @@
         <w:pStyle w:val="Caption"/>
         <w:jc w:val="center"/>
       </w:pPr>
-      <w:bookmarkStart w:id="49" w:name="_Ref12495836"/>
-      <w:bookmarkStart w:id="50" w:name="_Toc12497129"/>
+      <w:bookmarkStart w:id="50" w:name="_Ref12495836"/>
+      <w:bookmarkStart w:id="51" w:name="_Toc12497129"/>
       <w:r>
         <w:t xml:space="preserve">Şekil </w:t>
       </w:r>
-      <w:r>
-        <w:fldChar w:fldCharType="begin"/>
-      </w:r>
-      <w:r>
-        <w:instrText xml:space="preserve"> SEQ Şekil \* ARABIC </w:instrText>
-      </w:r>
-      <w:r>
-        <w:fldChar w:fldCharType="separate"/>
-      </w:r>
-      <w:r>
-        <w:rPr>
-          <w:noProof/>
-        </w:rPr>
-        <w:t>16</w:t>
-      </w:r>
-      <w:r>
-        <w:fldChar w:fldCharType="end"/>
-      </w:r>
-      <w:bookmarkEnd w:id="49"/>
+      <w:fldSimple w:instr=" SEQ Şekil \* ARABIC ">
+        <w:r>
+          <w:rPr>
+            <w:noProof/>
+          </w:rPr>
+          <w:t>16</w:t>
+        </w:r>
+      </w:fldSimple>
+      <w:bookmarkEnd w:id="50"/>
       <w:r>
         <w:t xml:space="preserve">. </w:t>
       </w:r>
       <w:r>
         <w:t>Eşik değerine bağlı ayrım oranı ve hata</w:t>
       </w:r>
-      <w:bookmarkEnd w:id="50"/>
+      <w:bookmarkEnd w:id="51"/>
     </w:p>
     <w:p>
       <w:pPr>
@@ -30836,37 +30556,27 @@
         <w:pStyle w:val="Caption"/>
         <w:jc w:val="center"/>
       </w:pPr>
-      <w:bookmarkStart w:id="51" w:name="_Ref12495905"/>
-      <w:bookmarkStart w:id="52" w:name="_Toc12497130"/>
+      <w:bookmarkStart w:id="52" w:name="_Ref12495905"/>
+      <w:bookmarkStart w:id="53" w:name="_Toc12497130"/>
       <w:r>
         <w:t xml:space="preserve">Şekil </w:t>
       </w:r>
-      <w:r>
-        <w:fldChar w:fldCharType="begin"/>
-      </w:r>
-      <w:r>
-        <w:instrText xml:space="preserve"> SEQ Şekil \* ARABIC </w:instrText>
-      </w:r>
-      <w:r>
-        <w:fldChar w:fldCharType="separate"/>
-      </w:r>
-      <w:r>
-        <w:rPr>
-          <w:noProof/>
-        </w:rPr>
-        <w:t>17</w:t>
-      </w:r>
-      <w:r>
-        <w:fldChar w:fldCharType="end"/>
-      </w:r>
-      <w:bookmarkEnd w:id="51"/>
+      <w:fldSimple w:instr=" SEQ Şekil \* ARABIC ">
+        <w:r>
+          <w:rPr>
+            <w:noProof/>
+          </w:rPr>
+          <w:t>17</w:t>
+        </w:r>
+      </w:fldSimple>
+      <w:bookmarkEnd w:id="52"/>
       <w:r>
         <w:t xml:space="preserve">. </w:t>
       </w:r>
       <w:r>
         <w:t>C-MLP/MLP dizayn</w:t>
       </w:r>
-      <w:bookmarkEnd w:id="52"/>
+      <w:bookmarkEnd w:id="53"/>
     </w:p>
     <w:p>
       <w:pPr>
@@ -31123,7 +30833,7 @@
           <w:noProof/>
           <w:szCs w:val="20"/>
         </w:rPr>
-        <w:t>6</w:t>
+        <w:t>14</w:t>
       </w:r>
       <w:r>
         <w:rPr>
@@ -31177,7 +30887,7 @@
           <w:noProof/>
           <w:szCs w:val="20"/>
         </w:rPr>
-        <w:t>6</w:t>
+        <w:t>14</w:t>
       </w:r>
       <w:r>
         <w:rPr>
@@ -31321,37 +31031,27 @@
           <w:color w:val="000000"/>
         </w:rPr>
       </w:pPr>
-      <w:bookmarkStart w:id="53" w:name="_Ref12495926"/>
-      <w:bookmarkStart w:id="54" w:name="_Toc12497131"/>
+      <w:bookmarkStart w:id="54" w:name="_Ref12495926"/>
+      <w:bookmarkStart w:id="55" w:name="_Toc12497131"/>
       <w:r>
         <w:t xml:space="preserve">Şekil </w:t>
       </w:r>
-      <w:r>
-        <w:fldChar w:fldCharType="begin"/>
-      </w:r>
-      <w:r>
-        <w:instrText xml:space="preserve"> SEQ Şekil \* ARABIC </w:instrText>
-      </w:r>
-      <w:r>
-        <w:fldChar w:fldCharType="separate"/>
-      </w:r>
-      <w:r>
-        <w:rPr>
-          <w:noProof/>
-        </w:rPr>
-        <w:t>18</w:t>
-      </w:r>
-      <w:r>
-        <w:fldChar w:fldCharType="end"/>
-      </w:r>
-      <w:bookmarkEnd w:id="53"/>
+      <w:fldSimple w:instr=" SEQ Şekil \* ARABIC ">
+        <w:r>
+          <w:rPr>
+            <w:noProof/>
+          </w:rPr>
+          <w:t>18</w:t>
+        </w:r>
+      </w:fldSimple>
+      <w:bookmarkEnd w:id="54"/>
       <w:r>
         <w:t xml:space="preserve">. </w:t>
       </w:r>
       <w:r>
         <w:t>C-MLP dinamik dizayn</w:t>
       </w:r>
-      <w:bookmarkEnd w:id="54"/>
+      <w:bookmarkEnd w:id="55"/>
     </w:p>
     <w:p>
       <w:pPr>
@@ -31427,37 +31127,27 @@
         <w:pStyle w:val="Caption"/>
         <w:jc w:val="center"/>
       </w:pPr>
-      <w:bookmarkStart w:id="55" w:name="_Ref12495940"/>
-      <w:bookmarkStart w:id="56" w:name="_Toc12497132"/>
+      <w:bookmarkStart w:id="56" w:name="_Ref12495940"/>
+      <w:bookmarkStart w:id="57" w:name="_Toc12497132"/>
       <w:r>
         <w:t xml:space="preserve">Şekil </w:t>
       </w:r>
-      <w:r>
-        <w:fldChar w:fldCharType="begin"/>
-      </w:r>
-      <w:r>
-        <w:instrText xml:space="preserve"> SEQ Şekil \* ARABIC </w:instrText>
-      </w:r>
-      <w:r>
-        <w:fldChar w:fldCharType="separate"/>
-      </w:r>
-      <w:r>
-        <w:rPr>
-          <w:noProof/>
-        </w:rPr>
-        <w:t>19</w:t>
-      </w:r>
-      <w:r>
-        <w:fldChar w:fldCharType="end"/>
-      </w:r>
-      <w:bookmarkEnd w:id="55"/>
+      <w:fldSimple w:instr=" SEQ Şekil \* ARABIC ">
+        <w:r>
+          <w:rPr>
+            <w:noProof/>
+          </w:rPr>
+          <w:t>19</w:t>
+        </w:r>
+      </w:fldSimple>
+      <w:bookmarkEnd w:id="56"/>
       <w:r>
         <w:t xml:space="preserve">. </w:t>
       </w:r>
       <w:r>
         <w:t>C-MLP dinamik dizaynında sınıflandırmada kullanılan eşik sayısına göre optimal maliyet</w:t>
       </w:r>
-      <w:bookmarkEnd w:id="56"/>
+      <w:bookmarkEnd w:id="57"/>
     </w:p>
     <w:p>
       <w:pPr>
@@ -32039,9 +31729,9 @@
           <w:color w:val="000000"/>
         </w:rPr>
       </w:pPr>
-      <w:bookmarkStart w:id="57" w:name="_Ref12376261"/>
       <w:bookmarkStart w:id="58" w:name="_Ref12376267"/>
-      <w:bookmarkStart w:id="59" w:name="_Toc12497237"/>
+      <w:bookmarkStart w:id="59" w:name="_Ref12376261"/>
+      <w:bookmarkStart w:id="60" w:name="_Toc12497237"/>
       <w:r>
         <w:rPr>
           <w:rFonts w:cs="Times New Roman"/>
@@ -32086,8 +31776,8 @@
         </w:rPr>
         <w:t xml:space="preserve"> C-MLP dinamik dizaynında artan ayrım noktasına göre seçilen en iyi noktalar ve maliyetleri</w:t>
       </w:r>
-      <w:bookmarkEnd w:id="57"/>
       <w:bookmarkEnd w:id="59"/>
+      <w:bookmarkEnd w:id="60"/>
     </w:p>
     <w:p>
       <w:pPr>
@@ -32322,7 +32012,7 @@
           <w:noProof/>
           <w:szCs w:val="20"/>
         </w:rPr>
-        <w:t>5</w:t>
+        <w:t>13</w:t>
       </w:r>
       <w:r>
         <w:rPr>
@@ -32376,7 +32066,7 @@
           <w:noProof/>
           <w:szCs w:val="20"/>
         </w:rPr>
-        <w:t>5</w:t>
+        <w:t>13</w:t>
       </w:r>
       <w:r>
         <w:rPr>
@@ -33093,6 +32783,7 @@
           <w:szCs w:val="20"/>
           <w:lang w:val="tr-TR" w:eastAsia="tr-TR" w:bidi="ar-SA"/>
         </w:rPr>
+        <w:instrText xml:space="preserve"> \* MERGEFORMAT </w:instrText>
       </w:r>
       <w:r>
         <w:rPr>
@@ -33103,7 +32794,6 @@
           <w:szCs w:val="20"/>
           <w:lang w:val="tr-TR" w:eastAsia="tr-TR" w:bidi="ar-SA"/>
         </w:rPr>
-        <w:instrText xml:space="preserve"> \* MERGEFORMAT </w:instrText>
       </w:r>
       <w:r>
         <w:rPr>
@@ -33117,6 +32807,21 @@
         <w:fldChar w:fldCharType="separate"/>
       </w:r>
       <w:r>
+        <w:t xml:space="preserve">Tablo </w:t>
+      </w:r>
+      <w:r>
+        <w:rPr>
+          <w:noProof/>
+        </w:rPr>
+        <w:t>15.</w:t>
+      </w:r>
+      <w:r>
+        <w:t xml:space="preserve"> </w:t>
+      </w:r>
+      <w:r>
+        <w:t>Dataset  İstatislikleri</w:t>
+      </w:r>
+      <w:r>
         <w:rPr>
           <w:rFonts w:ascii="Times New Roman" w:eastAsia="Times New Roman" w:hAnsi="Times New Roman" w:cs="Times New Roman"/>
           <w:color w:val="000000"/>
@@ -33169,6 +32874,7 @@
           <w:szCs w:val="20"/>
           <w:lang w:val="tr-TR" w:eastAsia="tr-TR" w:bidi="ar-SA"/>
         </w:rPr>
+        <w:instrText xml:space="preserve"> \* MERGEFORMAT </w:instrText>
       </w:r>
       <w:r>
         <w:rPr>
@@ -33179,7 +32885,6 @@
           <w:szCs w:val="20"/>
           <w:lang w:val="tr-TR" w:eastAsia="tr-TR" w:bidi="ar-SA"/>
         </w:rPr>
-        <w:instrText xml:space="preserve"> \* MERGEFORMAT </w:instrText>
       </w:r>
       <w:r>
         <w:rPr>
@@ -33309,30 +33014,20 @@
                                 <w:lang w:eastAsia="en-US"/>
                               </w:rPr>
                             </w:pPr>
-                            <w:bookmarkStart w:id="60" w:name="_Ref12495221"/>
                             <w:bookmarkStart w:id="61" w:name="_Ref12495227"/>
-                            <w:bookmarkStart w:id="62" w:name="_Toc12497238"/>
+                            <w:bookmarkStart w:id="62" w:name="_Ref12495221"/>
+                            <w:bookmarkStart w:id="63" w:name="_Toc12497238"/>
                             <w:r>
                               <w:t xml:space="preserve">Tablo </w:t>
                             </w:r>
-                            <w:r>
-                              <w:fldChar w:fldCharType="begin"/>
-                            </w:r>
-                            <w:r>
-                              <w:instrText xml:space="preserve"> SEQ Tablo \* ARABIC </w:instrText>
-                            </w:r>
-                            <w:r>
-                              <w:fldChar w:fldCharType="separate"/>
-                            </w:r>
-                            <w:r>
-                              <w:rPr>
-                                <w:noProof/>
-                              </w:rPr>
-                              <w:t>15</w:t>
-                            </w:r>
-                            <w:r>
-                              <w:fldChar w:fldCharType="end"/>
-                            </w:r>
+                            <w:fldSimple w:instr=" SEQ Tablo \* ARABIC ">
+                              <w:r>
+                                <w:rPr>
+                                  <w:noProof/>
+                                </w:rPr>
+                                <w:t>15</w:t>
+                              </w:r>
+                            </w:fldSimple>
                             <w:bookmarkEnd w:id="61"/>
                             <w:r>
                               <w:t xml:space="preserve">. </w:t>
@@ -33340,8 +33035,8 @@
                             <w:r>
                               <w:t>Dataset  İstatislikleri</w:t>
                             </w:r>
-                            <w:bookmarkEnd w:id="60"/>
                             <w:bookmarkEnd w:id="62"/>
+                            <w:bookmarkEnd w:id="63"/>
                           </w:p>
                         </w:txbxContent>
                       </wps:txbx>
@@ -33375,30 +33070,20 @@
                           <w:lang w:eastAsia="en-US"/>
                         </w:rPr>
                       </w:pPr>
-                      <w:bookmarkStart w:id="63" w:name="_Ref12495221"/>
                       <w:bookmarkStart w:id="64" w:name="_Ref12495227"/>
-                      <w:bookmarkStart w:id="65" w:name="_Toc12497238"/>
+                      <w:bookmarkStart w:id="65" w:name="_Ref12495221"/>
+                      <w:bookmarkStart w:id="66" w:name="_Toc12497238"/>
                       <w:r>
                         <w:t xml:space="preserve">Tablo </w:t>
                       </w:r>
-                      <w:r>
-                        <w:fldChar w:fldCharType="begin"/>
-                      </w:r>
-                      <w:r>
-                        <w:instrText xml:space="preserve"> SEQ Tablo \* ARABIC </w:instrText>
-                      </w:r>
-                      <w:r>
-                        <w:fldChar w:fldCharType="separate"/>
-                      </w:r>
-                      <w:r>
-                        <w:rPr>
-                          <w:noProof/>
-                        </w:rPr>
-                        <w:t>15</w:t>
-                      </w:r>
-                      <w:r>
-                        <w:fldChar w:fldCharType="end"/>
-                      </w:r>
+                      <w:fldSimple w:instr=" SEQ Tablo \* ARABIC ">
+                        <w:r>
+                          <w:rPr>
+                            <w:noProof/>
+                          </w:rPr>
+                          <w:t>15</w:t>
+                        </w:r>
+                      </w:fldSimple>
                       <w:bookmarkEnd w:id="64"/>
                       <w:r>
                         <w:t xml:space="preserve">. </w:t>
@@ -33406,8 +33091,8 @@
                       <w:r>
                         <w:t>Dataset  İstatislikleri</w:t>
                       </w:r>
-                      <w:bookmarkEnd w:id="63"/>
                       <w:bookmarkEnd w:id="65"/>
+                      <w:bookmarkEnd w:id="66"/>
                     </w:p>
                   </w:txbxContent>
                 </v:textbox>
@@ -33807,74 +33492,74 @@
         <w:rPr>
           <w:lang w:eastAsia="tr-TR"/>
         </w:rPr>
+        <w:instrText xml:space="preserve"> \* MERGEFORMAT </w:instrText>
       </w:r>
       <w:r>
         <w:rPr>
           <w:lang w:eastAsia="tr-TR"/>
         </w:rPr>
+      </w:r>
+      <w:r>
+        <w:rPr>
+          <w:lang w:eastAsia="tr-TR"/>
+        </w:rPr>
+        <w:fldChar w:fldCharType="separate"/>
+      </w:r>
+      <w:r>
+        <w:t xml:space="preserve">Şekil </w:t>
+      </w:r>
+      <w:r>
+        <w:rPr>
+          <w:noProof/>
+        </w:rPr>
+        <w:t>20</w:t>
+      </w:r>
+      <w:r>
+        <w:rPr>
+          <w:lang w:eastAsia="tr-TR"/>
+        </w:rPr>
+        <w:fldChar w:fldCharType="end"/>
+      </w:r>
+      <w:r>
+        <w:rPr>
+          <w:lang w:eastAsia="tr-TR"/>
+        </w:rPr>
+        <w:t xml:space="preserve"> </w:t>
+      </w:r>
+      <w:r>
+        <w:rPr>
+          <w:lang w:eastAsia="tr-TR"/>
+        </w:rPr>
+        <w:t>ve</w:t>
+      </w:r>
+      <w:r>
+        <w:rPr>
+          <w:lang w:eastAsia="tr-TR"/>
+        </w:rPr>
+        <w:t xml:space="preserve"> </w:t>
+      </w:r>
+      <w:r>
+        <w:rPr>
+          <w:lang w:eastAsia="tr-TR"/>
+        </w:rPr>
+        <w:fldChar w:fldCharType="begin"/>
+      </w:r>
+      <w:r>
+        <w:rPr>
+          <w:lang w:eastAsia="tr-TR"/>
+        </w:rPr>
+        <w:instrText xml:space="preserve"> REF _Ref12495297 \h </w:instrText>
+      </w:r>
+      <w:r>
+        <w:rPr>
+          <w:lang w:eastAsia="tr-TR"/>
+        </w:rPr>
         <w:instrText xml:space="preserve"> \* MERGEFORMAT </w:instrText>
       </w:r>
       <w:r>
         <w:rPr>
           <w:lang w:eastAsia="tr-TR"/>
         </w:rPr>
-        <w:fldChar w:fldCharType="separate"/>
-      </w:r>
-      <w:r>
-        <w:t xml:space="preserve">Şekil </w:t>
-      </w:r>
-      <w:r>
-        <w:rPr>
-          <w:noProof/>
-        </w:rPr>
-        <w:t>20</w:t>
-      </w:r>
-      <w:r>
-        <w:rPr>
-          <w:lang w:eastAsia="tr-TR"/>
-        </w:rPr>
-        <w:fldChar w:fldCharType="end"/>
-      </w:r>
-      <w:r>
-        <w:rPr>
-          <w:lang w:eastAsia="tr-TR"/>
-        </w:rPr>
-        <w:t xml:space="preserve"> </w:t>
-      </w:r>
-      <w:r>
-        <w:rPr>
-          <w:lang w:eastAsia="tr-TR"/>
-        </w:rPr>
-        <w:t>ve</w:t>
-      </w:r>
-      <w:r>
-        <w:rPr>
-          <w:lang w:eastAsia="tr-TR"/>
-        </w:rPr>
-        <w:t xml:space="preserve"> </w:t>
-      </w:r>
-      <w:r>
-        <w:rPr>
-          <w:lang w:eastAsia="tr-TR"/>
-        </w:rPr>
-        <w:fldChar w:fldCharType="begin"/>
-      </w:r>
-      <w:r>
-        <w:rPr>
-          <w:lang w:eastAsia="tr-TR"/>
-        </w:rPr>
-        <w:instrText xml:space="preserve"> REF _Ref12495297 \h </w:instrText>
-      </w:r>
-      <w:r>
-        <w:rPr>
-          <w:lang w:eastAsia="tr-TR"/>
-        </w:rPr>
-      </w:r>
-      <w:r>
-        <w:rPr>
-          <w:lang w:eastAsia="tr-TR"/>
-        </w:rPr>
-        <w:instrText xml:space="preserve"> \* MERGEFORMAT </w:instrText>
       </w:r>
       <w:r>
         <w:rPr>
@@ -34084,30 +33769,20 @@
                                 <w:lang w:eastAsia="zh-CN" w:bidi="hi-IN"/>
                               </w:rPr>
                             </w:pPr>
-                            <w:bookmarkStart w:id="66" w:name="_Ref12495263"/>
                             <w:bookmarkStart w:id="67" w:name="_Ref12495268"/>
-                            <w:bookmarkStart w:id="68" w:name="_Toc12497133"/>
+                            <w:bookmarkStart w:id="68" w:name="_Ref12495263"/>
+                            <w:bookmarkStart w:id="69" w:name="_Toc12497133"/>
                             <w:r>
                               <w:t xml:space="preserve">Şekil </w:t>
                             </w:r>
-                            <w:r>
-                              <w:fldChar w:fldCharType="begin"/>
-                            </w:r>
-                            <w:r>
-                              <w:instrText xml:space="preserve"> SEQ Şekil \* ARABIC </w:instrText>
-                            </w:r>
-                            <w:r>
-                              <w:fldChar w:fldCharType="separate"/>
-                            </w:r>
-                            <w:r>
-                              <w:rPr>
-                                <w:noProof/>
-                              </w:rPr>
-                              <w:t>20</w:t>
-                            </w:r>
-                            <w:r>
-                              <w:fldChar w:fldCharType="end"/>
-                            </w:r>
+                            <w:fldSimple w:instr=" SEQ Şekil \* ARABIC ">
+                              <w:r>
+                                <w:rPr>
+                                  <w:noProof/>
+                                </w:rPr>
+                                <w:t>20</w:t>
+                              </w:r>
+                            </w:fldSimple>
                             <w:bookmarkEnd w:id="67"/>
                             <w:r>
                               <w:t xml:space="preserve">. </w:t>
@@ -34121,8 +33796,8 @@
                             <w:r>
                               <w:t xml:space="preserve"> sayıları hız grafikleri</w:t>
                             </w:r>
-                            <w:bookmarkEnd w:id="66"/>
                             <w:bookmarkEnd w:id="68"/>
+                            <w:bookmarkEnd w:id="69"/>
                           </w:p>
                         </w:txbxContent>
                       </wps:txbx>
@@ -34153,30 +33828,20 @@
                           <w:lang w:eastAsia="zh-CN" w:bidi="hi-IN"/>
                         </w:rPr>
                       </w:pPr>
-                      <w:bookmarkStart w:id="69" w:name="_Ref12495263"/>
                       <w:bookmarkStart w:id="70" w:name="_Ref12495268"/>
-                      <w:bookmarkStart w:id="71" w:name="_Toc12497133"/>
+                      <w:bookmarkStart w:id="71" w:name="_Ref12495263"/>
+                      <w:bookmarkStart w:id="72" w:name="_Toc12497133"/>
                       <w:r>
                         <w:t xml:space="preserve">Şekil </w:t>
                       </w:r>
-                      <w:r>
-                        <w:fldChar w:fldCharType="begin"/>
-                      </w:r>
-                      <w:r>
-                        <w:instrText xml:space="preserve"> SEQ Şekil \* ARABIC </w:instrText>
-                      </w:r>
-                      <w:r>
-                        <w:fldChar w:fldCharType="separate"/>
-                      </w:r>
-                      <w:r>
-                        <w:rPr>
-                          <w:noProof/>
-                        </w:rPr>
-                        <w:t>20</w:t>
-                      </w:r>
-                      <w:r>
-                        <w:fldChar w:fldCharType="end"/>
-                      </w:r>
+                      <w:fldSimple w:instr=" SEQ Şekil \* ARABIC ">
+                        <w:r>
+                          <w:rPr>
+                            <w:noProof/>
+                          </w:rPr>
+                          <w:t>20</w:t>
+                        </w:r>
+                      </w:fldSimple>
                       <w:bookmarkEnd w:id="70"/>
                       <w:r>
                         <w:t xml:space="preserve">. </w:t>
@@ -34190,8 +33855,8 @@
                       <w:r>
                         <w:t xml:space="preserve"> sayıları hız grafikleri</w:t>
                       </w:r>
-                      <w:bookmarkEnd w:id="69"/>
                       <w:bookmarkEnd w:id="71"/>
+                      <w:bookmarkEnd w:id="72"/>
                     </w:p>
                   </w:txbxContent>
                 </v:textbox>
@@ -34578,30 +34243,20 @@
                                 <w:lang w:eastAsia="zh-CN" w:bidi="hi-IN"/>
                               </w:rPr>
                             </w:pPr>
-                            <w:bookmarkStart w:id="72" w:name="_Ref12495297"/>
-                            <w:bookmarkStart w:id="73" w:name="_Toc12497134"/>
+                            <w:bookmarkStart w:id="73" w:name="_Ref12495297"/>
+                            <w:bookmarkStart w:id="74" w:name="_Toc12497134"/>
                             <w:r>
                               <w:t xml:space="preserve">Şekil </w:t>
                             </w:r>
-                            <w:r>
-                              <w:fldChar w:fldCharType="begin"/>
-                            </w:r>
-                            <w:r>
-                              <w:instrText xml:space="preserve"> SEQ Şekil \* ARABIC </w:instrText>
-                            </w:r>
-                            <w:r>
-                              <w:fldChar w:fldCharType="separate"/>
-                            </w:r>
-                            <w:r>
-                              <w:rPr>
-                                <w:noProof/>
-                              </w:rPr>
-                              <w:t>21</w:t>
-                            </w:r>
-                            <w:r>
-                              <w:fldChar w:fldCharType="end"/>
-                            </w:r>
-                            <w:bookmarkEnd w:id="72"/>
+                            <w:fldSimple w:instr=" SEQ Şekil \* ARABIC ">
+                              <w:r>
+                                <w:rPr>
+                                  <w:noProof/>
+                                </w:rPr>
+                                <w:t>21</w:t>
+                              </w:r>
+                            </w:fldSimple>
+                            <w:bookmarkEnd w:id="73"/>
                             <w:r>
                               <w:t xml:space="preserve">. </w:t>
                             </w:r>
@@ -34614,7 +34269,7 @@
                             <w:r>
                               <w:t xml:space="preserve"> sayıları hız grafikleri (logaritmik)</w:t>
                             </w:r>
-                            <w:bookmarkEnd w:id="73"/>
+                            <w:bookmarkEnd w:id="74"/>
                           </w:p>
                         </w:txbxContent>
                       </wps:txbx>
@@ -34645,30 +34300,20 @@
                           <w:lang w:eastAsia="zh-CN" w:bidi="hi-IN"/>
                         </w:rPr>
                       </w:pPr>
-                      <w:bookmarkStart w:id="74" w:name="_Ref12495297"/>
-                      <w:bookmarkStart w:id="75" w:name="_Toc12497134"/>
+                      <w:bookmarkStart w:id="75" w:name="_Ref12495297"/>
+                      <w:bookmarkStart w:id="76" w:name="_Toc12497134"/>
                       <w:r>
                         <w:t xml:space="preserve">Şekil </w:t>
                       </w:r>
-                      <w:r>
-                        <w:fldChar w:fldCharType="begin"/>
-                      </w:r>
-                      <w:r>
-                        <w:instrText xml:space="preserve"> SEQ Şekil \* ARABIC </w:instrText>
-                      </w:r>
-                      <w:r>
-                        <w:fldChar w:fldCharType="separate"/>
-                      </w:r>
-                      <w:r>
-                        <w:rPr>
-                          <w:noProof/>
-                        </w:rPr>
-                        <w:t>21</w:t>
-                      </w:r>
-                      <w:r>
-                        <w:fldChar w:fldCharType="end"/>
-                      </w:r>
-                      <w:bookmarkEnd w:id="74"/>
+                      <w:fldSimple w:instr=" SEQ Şekil \* ARABIC ">
+                        <w:r>
+                          <w:rPr>
+                            <w:noProof/>
+                          </w:rPr>
+                          <w:t>21</w:t>
+                        </w:r>
+                      </w:fldSimple>
+                      <w:bookmarkEnd w:id="75"/>
                       <w:r>
                         <w:t xml:space="preserve">. </w:t>
                       </w:r>
@@ -34681,7 +34326,7 @@
                       <w:r>
                         <w:t xml:space="preserve"> sayıları hız grafikleri (logaritmik)</w:t>
                       </w:r>
-                      <w:bookmarkEnd w:id="75"/>
+                      <w:bookmarkEnd w:id="76"/>
                     </w:p>
                   </w:txbxContent>
                 </v:textbox>
@@ -34975,6 +34620,7 @@
           <w:szCs w:val="20"/>
           <w:lang w:val="tr-TR" w:eastAsia="tr-TR" w:bidi="ar-SA"/>
         </w:rPr>
+        <w:instrText xml:space="preserve"> \* MERGEFORMAT </w:instrText>
       </w:r>
       <w:r>
         <w:rPr>
@@ -34985,7 +34631,6 @@
           <w:szCs w:val="20"/>
           <w:lang w:val="tr-TR" w:eastAsia="tr-TR" w:bidi="ar-SA"/>
         </w:rPr>
-        <w:instrText xml:space="preserve"> \* MERGEFORMAT </w:instrText>
       </w:r>
       <w:r>
         <w:rPr>
@@ -35071,6 +34716,7 @@
           <w:szCs w:val="20"/>
           <w:lang w:val="tr-TR" w:eastAsia="tr-TR" w:bidi="ar-SA"/>
         </w:rPr>
+        <w:instrText xml:space="preserve"> \* MERGEFORMAT </w:instrText>
       </w:r>
       <w:r>
         <w:rPr>
@@ -35081,7 +34727,6 @@
           <w:szCs w:val="20"/>
           <w:lang w:val="tr-TR" w:eastAsia="tr-TR" w:bidi="ar-SA"/>
         </w:rPr>
-        <w:instrText xml:space="preserve"> \* MERGEFORMAT </w:instrText>
       </w:r>
       <w:r>
         <w:rPr>
@@ -35260,37 +34905,27 @@
                                 <w:lang w:eastAsia="zh-CN" w:bidi="hi-IN"/>
                               </w:rPr>
                             </w:pPr>
-                            <w:bookmarkStart w:id="76" w:name="_Ref12495327"/>
-                            <w:bookmarkStart w:id="77" w:name="_Toc12497135"/>
+                            <w:bookmarkStart w:id="77" w:name="_Ref12495327"/>
+                            <w:bookmarkStart w:id="78" w:name="_Toc12497135"/>
                             <w:r>
                               <w:t xml:space="preserve">Şekil </w:t>
                             </w:r>
-                            <w:r>
-                              <w:fldChar w:fldCharType="begin"/>
-                            </w:r>
-                            <w:r>
-                              <w:instrText xml:space="preserve"> SEQ Şekil \* ARABIC </w:instrText>
-                            </w:r>
-                            <w:r>
-                              <w:fldChar w:fldCharType="separate"/>
-                            </w:r>
-                            <w:r>
-                              <w:rPr>
-                                <w:noProof/>
-                              </w:rPr>
-                              <w:t>22</w:t>
-                            </w:r>
-                            <w:r>
-                              <w:fldChar w:fldCharType="end"/>
-                            </w:r>
-                            <w:bookmarkEnd w:id="76"/>
+                            <w:fldSimple w:instr=" SEQ Şekil \* ARABIC ">
+                              <w:r>
+                                <w:rPr>
+                                  <w:noProof/>
+                                </w:rPr>
+                                <w:t>22</w:t>
+                              </w:r>
+                            </w:fldSimple>
+                            <w:bookmarkEnd w:id="77"/>
                             <w:r>
                               <w:t xml:space="preserve">. </w:t>
                             </w:r>
                             <w:r>
                               <w:t>Sabit çekirdek  sayısı için değişen  veri büyüklüğü grafikleri</w:t>
                             </w:r>
-                            <w:bookmarkEnd w:id="77"/>
+                            <w:bookmarkEnd w:id="78"/>
                           </w:p>
                         </w:txbxContent>
                       </wps:txbx>
@@ -35321,37 +34956,27 @@
                           <w:lang w:eastAsia="zh-CN" w:bidi="hi-IN"/>
                         </w:rPr>
                       </w:pPr>
-                      <w:bookmarkStart w:id="78" w:name="_Ref12495327"/>
-                      <w:bookmarkStart w:id="79" w:name="_Toc12497135"/>
+                      <w:bookmarkStart w:id="79" w:name="_Ref12495327"/>
+                      <w:bookmarkStart w:id="80" w:name="_Toc12497135"/>
                       <w:r>
                         <w:t xml:space="preserve">Şekil </w:t>
                       </w:r>
-                      <w:r>
-                        <w:fldChar w:fldCharType="begin"/>
-                      </w:r>
-                      <w:r>
-                        <w:instrText xml:space="preserve"> SEQ Şekil \* ARABIC </w:instrText>
-                      </w:r>
-                      <w:r>
-                        <w:fldChar w:fldCharType="separate"/>
-                      </w:r>
-                      <w:r>
-                        <w:rPr>
-                          <w:noProof/>
-                        </w:rPr>
-                        <w:t>22</w:t>
-                      </w:r>
-                      <w:r>
-                        <w:fldChar w:fldCharType="end"/>
-                      </w:r>
-                      <w:bookmarkEnd w:id="78"/>
+                      <w:fldSimple w:instr=" SEQ Şekil \* ARABIC ">
+                        <w:r>
+                          <w:rPr>
+                            <w:noProof/>
+                          </w:rPr>
+                          <w:t>22</w:t>
+                        </w:r>
+                      </w:fldSimple>
+                      <w:bookmarkEnd w:id="79"/>
                       <w:r>
                         <w:t xml:space="preserve">. </w:t>
                       </w:r>
                       <w:r>
                         <w:t>Sabit çekirdek  sayısı için değişen  veri büyüklüğü grafikleri</w:t>
                       </w:r>
-                      <w:bookmarkEnd w:id="79"/>
+                      <w:bookmarkEnd w:id="80"/>
                     </w:p>
                   </w:txbxContent>
                 </v:textbox>
@@ -35498,30 +35123,20 @@
                                 <w:lang w:eastAsia="zh-CN" w:bidi="hi-IN"/>
                               </w:rPr>
                             </w:pPr>
-                            <w:bookmarkStart w:id="80" w:name="_Ref12495344"/>
-                            <w:bookmarkStart w:id="81" w:name="_Toc12497136"/>
+                            <w:bookmarkStart w:id="81" w:name="_Ref12495344"/>
+                            <w:bookmarkStart w:id="82" w:name="_Toc12497136"/>
                             <w:r>
                               <w:t xml:space="preserve">Şekil </w:t>
                             </w:r>
-                            <w:r>
-                              <w:fldChar w:fldCharType="begin"/>
-                            </w:r>
-                            <w:r>
-                              <w:instrText xml:space="preserve"> SEQ Şekil \* ARABIC </w:instrText>
-                            </w:r>
-                            <w:r>
-                              <w:fldChar w:fldCharType="separate"/>
-                            </w:r>
-                            <w:r>
-                              <w:rPr>
-                                <w:noProof/>
-                              </w:rPr>
-                              <w:t>23</w:t>
-                            </w:r>
-                            <w:r>
-                              <w:fldChar w:fldCharType="end"/>
-                            </w:r>
-                            <w:bookmarkEnd w:id="80"/>
+                            <w:fldSimple w:instr=" SEQ Şekil \* ARABIC ">
+                              <w:r>
+                                <w:rPr>
+                                  <w:noProof/>
+                                </w:rPr>
+                                <w:t>23</w:t>
+                              </w:r>
+                            </w:fldSimple>
+                            <w:bookmarkEnd w:id="81"/>
                             <w:r>
                               <w:t xml:space="preserve">. </w:t>
                             </w:r>
@@ -35534,7 +35149,7 @@
                             <w:r>
                               <w:t xml:space="preserve">  sayısı için değişen  Veri Büyüklüğü grafikleri (logaritmik)</w:t>
                             </w:r>
-                            <w:bookmarkEnd w:id="81"/>
+                            <w:bookmarkEnd w:id="82"/>
                           </w:p>
                         </w:txbxContent>
                       </wps:txbx>
@@ -35565,30 +35180,20 @@
                           <w:lang w:eastAsia="zh-CN" w:bidi="hi-IN"/>
                         </w:rPr>
                       </w:pPr>
-                      <w:bookmarkStart w:id="82" w:name="_Ref12495344"/>
-                      <w:bookmarkStart w:id="83" w:name="_Toc12497136"/>
+                      <w:bookmarkStart w:id="83" w:name="_Ref12495344"/>
+                      <w:bookmarkStart w:id="84" w:name="_Toc12497136"/>
                       <w:r>
                         <w:t xml:space="preserve">Şekil </w:t>
                       </w:r>
-                      <w:r>
-                        <w:fldChar w:fldCharType="begin"/>
-                      </w:r>
-                      <w:r>
-                        <w:instrText xml:space="preserve"> SEQ Şekil \* ARABIC </w:instrText>
-                      </w:r>
-                      <w:r>
-                        <w:fldChar w:fldCharType="separate"/>
-                      </w:r>
-                      <w:r>
-                        <w:rPr>
-                          <w:noProof/>
-                        </w:rPr>
-                        <w:t>23</w:t>
-                      </w:r>
-                      <w:r>
-                        <w:fldChar w:fldCharType="end"/>
-                      </w:r>
-                      <w:bookmarkEnd w:id="82"/>
+                      <w:fldSimple w:instr=" SEQ Şekil \* ARABIC ">
+                        <w:r>
+                          <w:rPr>
+                            <w:noProof/>
+                          </w:rPr>
+                          <w:t>23</w:t>
+                        </w:r>
+                      </w:fldSimple>
+                      <w:bookmarkEnd w:id="83"/>
                       <w:r>
                         <w:t xml:space="preserve">. </w:t>
                       </w:r>
@@ -35601,7 +35206,7 @@
                       <w:r>
                         <w:t xml:space="preserve">  sayısı için değişen  Veri Büyüklüğü grafikleri (logaritmik)</w:t>
                       </w:r>
-                      <w:bookmarkEnd w:id="83"/>
+                      <w:bookmarkEnd w:id="84"/>
                     </w:p>
                   </w:txbxContent>
                 </v:textbox>
@@ -35829,6 +35434,7 @@
           <w:szCs w:val="20"/>
           <w:lang w:val="tr-TR" w:eastAsia="tr-TR" w:bidi="ar-SA"/>
         </w:rPr>
+        <w:instrText xml:space="preserve"> \* MERGEFORMAT </w:instrText>
       </w:r>
       <w:r>
         <w:rPr>
@@ -35839,7 +35445,6 @@
           <w:szCs w:val="20"/>
           <w:lang w:val="tr-TR" w:eastAsia="tr-TR" w:bidi="ar-SA"/>
         </w:rPr>
-        <w:instrText xml:space="preserve"> \* MERGEFORMAT </w:instrText>
       </w:r>
       <w:r>
         <w:rPr>
@@ -35936,6 +35541,7 @@
           <w:szCs w:val="20"/>
           <w:lang w:val="tr-TR" w:eastAsia="tr-TR" w:bidi="ar-SA"/>
         </w:rPr>
+        <w:instrText xml:space="preserve"> \* MERGEFORMAT </w:instrText>
       </w:r>
       <w:r>
         <w:rPr>
@@ -35946,7 +35552,6 @@
           <w:szCs w:val="20"/>
           <w:lang w:val="tr-TR" w:eastAsia="tr-TR" w:bidi="ar-SA"/>
         </w:rPr>
-        <w:instrText xml:space="preserve"> \* MERGEFORMAT </w:instrText>
       </w:r>
       <w:r>
         <w:rPr>
@@ -36021,6 +35626,7 @@
           <w:szCs w:val="20"/>
           <w:lang w:val="tr-TR" w:eastAsia="tr-TR" w:bidi="ar-SA"/>
         </w:rPr>
+        <w:instrText xml:space="preserve"> \* MERGEFORMAT </w:instrText>
       </w:r>
       <w:r>
         <w:rPr>
@@ -36031,7 +35637,6 @@
           <w:szCs w:val="20"/>
           <w:lang w:val="tr-TR" w:eastAsia="tr-TR" w:bidi="ar-SA"/>
         </w:rPr>
-        <w:instrText xml:space="preserve"> \* MERGEFORMAT </w:instrText>
       </w:r>
       <w:r>
         <w:rPr>
@@ -36143,30 +35748,20 @@
                                 <w:lang w:eastAsia="zh-CN" w:bidi="hi-IN"/>
                               </w:rPr>
                             </w:pPr>
-                            <w:bookmarkStart w:id="84" w:name="_Ref12495406"/>
-                            <w:bookmarkStart w:id="85" w:name="_Toc12497137"/>
+                            <w:bookmarkStart w:id="85" w:name="_Ref12495406"/>
+                            <w:bookmarkStart w:id="86" w:name="_Toc12497137"/>
                             <w:r>
                               <w:t xml:space="preserve">Şekil </w:t>
                             </w:r>
-                            <w:r>
-                              <w:fldChar w:fldCharType="begin"/>
-                            </w:r>
-                            <w:r>
-                              <w:instrText xml:space="preserve"> SEQ Şekil \* ARABIC </w:instrText>
-                            </w:r>
-                            <w:r>
-                              <w:fldChar w:fldCharType="separate"/>
-                            </w:r>
-                            <w:r>
-                              <w:rPr>
-                                <w:noProof/>
-                              </w:rPr>
-                              <w:t>24</w:t>
-                            </w:r>
-                            <w:r>
-                              <w:fldChar w:fldCharType="end"/>
-                            </w:r>
-                            <w:bookmarkEnd w:id="84"/>
+                            <w:fldSimple w:instr=" SEQ Şekil \* ARABIC ">
+                              <w:r>
+                                <w:rPr>
+                                  <w:noProof/>
+                                </w:rPr>
+                                <w:t>24</w:t>
+                              </w:r>
+                            </w:fldSimple>
+                            <w:bookmarkEnd w:id="85"/>
                             <w:r>
                               <w:t xml:space="preserve">. </w:t>
                             </w:r>
@@ -36176,7 +35771,7 @@
                             <w:r>
                               <w:t>Hızlandırma</w:t>
                             </w:r>
-                            <w:bookmarkEnd w:id="85"/>
+                            <w:bookmarkEnd w:id="86"/>
                           </w:p>
                         </w:txbxContent>
                       </wps:txbx>
@@ -36209,30 +35804,20 @@
                           <w:lang w:eastAsia="zh-CN" w:bidi="hi-IN"/>
                         </w:rPr>
                       </w:pPr>
-                      <w:bookmarkStart w:id="86" w:name="_Ref12495406"/>
-                      <w:bookmarkStart w:id="87" w:name="_Toc12497137"/>
+                      <w:bookmarkStart w:id="87" w:name="_Ref12495406"/>
+                      <w:bookmarkStart w:id="88" w:name="_Toc12497137"/>
                       <w:r>
                         <w:t xml:space="preserve">Şekil </w:t>
                       </w:r>
-                      <w:r>
-                        <w:fldChar w:fldCharType="begin"/>
-                      </w:r>
-                      <w:r>
-                        <w:instrText xml:space="preserve"> SEQ Şekil \* ARABIC </w:instrText>
-                      </w:r>
-                      <w:r>
-                        <w:fldChar w:fldCharType="separate"/>
-                      </w:r>
-                      <w:r>
-                        <w:rPr>
-                          <w:noProof/>
-                        </w:rPr>
-                        <w:t>24</w:t>
-                      </w:r>
-                      <w:r>
-                        <w:fldChar w:fldCharType="end"/>
-                      </w:r>
-                      <w:bookmarkEnd w:id="86"/>
+                      <w:fldSimple w:instr=" SEQ Şekil \* ARABIC ">
+                        <w:r>
+                          <w:rPr>
+                            <w:noProof/>
+                          </w:rPr>
+                          <w:t>24</w:t>
+                        </w:r>
+                      </w:fldSimple>
+                      <w:bookmarkEnd w:id="87"/>
                       <w:r>
                         <w:t xml:space="preserve">. </w:t>
                       </w:r>
@@ -36242,7 +35827,7 @@
                       <w:r>
                         <w:t>Hızlandırma</w:t>
                       </w:r>
-                      <w:bookmarkEnd w:id="87"/>
+                      <w:bookmarkEnd w:id="88"/>
                     </w:p>
                   </w:txbxContent>
                 </v:textbox>
@@ -36611,30 +36196,20 @@
         <w:pStyle w:val="Caption"/>
         <w:keepNext/>
       </w:pPr>
-      <w:bookmarkStart w:id="88" w:name="_Ref12495057"/>
       <w:bookmarkStart w:id="89" w:name="_Ref12495066"/>
-      <w:bookmarkStart w:id="90" w:name="_Toc12497239"/>
+      <w:bookmarkStart w:id="90" w:name="_Ref12495057"/>
+      <w:bookmarkStart w:id="91" w:name="_Toc12497239"/>
       <w:r>
         <w:t xml:space="preserve">Tablo </w:t>
       </w:r>
-      <w:r>
-        <w:fldChar w:fldCharType="begin"/>
-      </w:r>
-      <w:r>
-        <w:instrText xml:space="preserve"> SEQ Tablo \* ARABIC </w:instrText>
-      </w:r>
-      <w:r>
-        <w:fldChar w:fldCharType="separate"/>
-      </w:r>
-      <w:r>
-        <w:rPr>
-          <w:noProof/>
-        </w:rPr>
-        <w:t>16</w:t>
-      </w:r>
-      <w:r>
-        <w:fldChar w:fldCharType="end"/>
-      </w:r>
+      <w:fldSimple w:instr=" SEQ Tablo \* ARABIC ">
+        <w:r>
+          <w:rPr>
+            <w:noProof/>
+          </w:rPr>
+          <w:t>16</w:t>
+        </w:r>
+      </w:fldSimple>
       <w:bookmarkEnd w:id="89"/>
       <w:r>
         <w:t>. Benchmark(#</w:t>
@@ -36645,8 +36220,8 @@
       <w:r>
         <w:t xml:space="preserve"> vs veri buyuklugu) sonuclari(saniye)</w:t>
       </w:r>
-      <w:bookmarkEnd w:id="88"/>
       <w:bookmarkEnd w:id="90"/>
+      <w:bookmarkEnd w:id="91"/>
     </w:p>
     <w:tbl>
       <w:tblPr>
@@ -38400,6 +37975,7 @@
           <w:szCs w:val="20"/>
           <w:lang w:val="tr-TR" w:eastAsia="tr-TR" w:bidi="ar-SA"/>
         </w:rPr>
+        <w:instrText xml:space="preserve"> \* MERGEFORMAT </w:instrText>
       </w:r>
       <w:r>
         <w:rPr>
@@ -38410,7 +37986,6 @@
           <w:szCs w:val="20"/>
           <w:lang w:val="tr-TR" w:eastAsia="tr-TR" w:bidi="ar-SA"/>
         </w:rPr>
-        <w:instrText xml:space="preserve"> \* MERGEFORMAT </w:instrText>
       </w:r>
       <w:r>
         <w:rPr>
@@ -38485,6 +38060,7 @@
           <w:szCs w:val="20"/>
           <w:lang w:val="tr-TR" w:eastAsia="tr-TR" w:bidi="ar-SA"/>
         </w:rPr>
+        <w:instrText xml:space="preserve"> \* MERGEFORMAT </w:instrText>
       </w:r>
       <w:r>
         <w:rPr>
@@ -38495,7 +38071,6 @@
           <w:szCs w:val="20"/>
           <w:lang w:val="tr-TR" w:eastAsia="tr-TR" w:bidi="ar-SA"/>
         </w:rPr>
-        <w:instrText xml:space="preserve"> \* MERGEFORMAT </w:instrText>
       </w:r>
       <w:r>
         <w:rPr>
@@ -38592,6 +38167,7 @@
           <w:szCs w:val="20"/>
           <w:lang w:val="tr-TR" w:eastAsia="tr-TR" w:bidi="ar-SA"/>
         </w:rPr>
+        <w:instrText xml:space="preserve"> \* MERGEFORMAT </w:instrText>
       </w:r>
       <w:r>
         <w:rPr>
@@ -38602,7 +38178,6 @@
           <w:szCs w:val="20"/>
           <w:lang w:val="tr-TR" w:eastAsia="tr-TR" w:bidi="ar-SA"/>
         </w:rPr>
-        <w:instrText xml:space="preserve"> \* MERGEFORMAT </w:instrText>
       </w:r>
       <w:r>
         <w:rPr>
@@ -38677,6 +38252,7 @@
           <w:szCs w:val="20"/>
           <w:lang w:val="tr-TR" w:eastAsia="tr-TR" w:bidi="ar-SA"/>
         </w:rPr>
+        <w:instrText xml:space="preserve"> \* MERGEFORMAT </w:instrText>
       </w:r>
       <w:r>
         <w:rPr>
@@ -38687,7 +38263,6 @@
           <w:szCs w:val="20"/>
           <w:lang w:val="tr-TR" w:eastAsia="tr-TR" w:bidi="ar-SA"/>
         </w:rPr>
-        <w:instrText xml:space="preserve"> \* MERGEFORMAT </w:instrText>
       </w:r>
       <w:r>
         <w:rPr>
@@ -38861,37 +38436,27 @@
                                 <w:lang w:eastAsia="zh-CN" w:bidi="hi-IN"/>
                               </w:rPr>
                             </w:pPr>
-                            <w:bookmarkStart w:id="91" w:name="_Ref12495128"/>
-                            <w:bookmarkStart w:id="92" w:name="_Toc12497138"/>
+                            <w:bookmarkStart w:id="92" w:name="_Ref12495128"/>
+                            <w:bookmarkStart w:id="93" w:name="_Toc12497138"/>
                             <w:r>
                               <w:t xml:space="preserve">Şekil </w:t>
                             </w:r>
-                            <w:r>
-                              <w:fldChar w:fldCharType="begin"/>
-                            </w:r>
-                            <w:r>
-                              <w:instrText xml:space="preserve"> SEQ Şekil \* ARABIC </w:instrText>
-                            </w:r>
-                            <w:r>
-                              <w:fldChar w:fldCharType="separate"/>
-                            </w:r>
-                            <w:r>
-                              <w:rPr>
-                                <w:noProof/>
-                              </w:rPr>
-                              <w:t>25</w:t>
-                            </w:r>
-                            <w:r>
-                              <w:fldChar w:fldCharType="end"/>
-                            </w:r>
-                            <w:bookmarkEnd w:id="91"/>
+                            <w:fldSimple w:instr=" SEQ Şekil \* ARABIC ">
+                              <w:r>
+                                <w:rPr>
+                                  <w:noProof/>
+                                </w:rPr>
+                                <w:t>25</w:t>
+                              </w:r>
+                            </w:fldSimple>
+                            <w:bookmarkEnd w:id="92"/>
                             <w:r>
                               <w:t xml:space="preserve">. </w:t>
                             </w:r>
                             <w:r>
                               <w:t>Benchmark Sonuçları</w:t>
                             </w:r>
-                            <w:bookmarkEnd w:id="92"/>
+                            <w:bookmarkEnd w:id="93"/>
                           </w:p>
                         </w:txbxContent>
                       </wps:txbx>
@@ -38922,37 +38487,27 @@
                           <w:lang w:eastAsia="zh-CN" w:bidi="hi-IN"/>
                         </w:rPr>
                       </w:pPr>
-                      <w:bookmarkStart w:id="93" w:name="_Ref12495128"/>
-                      <w:bookmarkStart w:id="94" w:name="_Toc12497138"/>
+                      <w:bookmarkStart w:id="94" w:name="_Ref12495128"/>
+                      <w:bookmarkStart w:id="95" w:name="_Toc12497138"/>
                       <w:r>
                         <w:t xml:space="preserve">Şekil </w:t>
                       </w:r>
-                      <w:r>
-                        <w:fldChar w:fldCharType="begin"/>
-                      </w:r>
-                      <w:r>
-                        <w:instrText xml:space="preserve"> SEQ Şekil \* ARABIC </w:instrText>
-                      </w:r>
-                      <w:r>
-                        <w:fldChar w:fldCharType="separate"/>
-                      </w:r>
-                      <w:r>
-                        <w:rPr>
-                          <w:noProof/>
-                        </w:rPr>
-                        <w:t>25</w:t>
-                      </w:r>
-                      <w:r>
-                        <w:fldChar w:fldCharType="end"/>
-                      </w:r>
-                      <w:bookmarkEnd w:id="93"/>
+                      <w:fldSimple w:instr=" SEQ Şekil \* ARABIC ">
+                        <w:r>
+                          <w:rPr>
+                            <w:noProof/>
+                          </w:rPr>
+                          <w:t>25</w:t>
+                        </w:r>
+                      </w:fldSimple>
+                      <w:bookmarkEnd w:id="94"/>
                       <w:r>
                         <w:t xml:space="preserve">. </w:t>
                       </w:r>
                       <w:r>
                         <w:t>Benchmark Sonuçları</w:t>
                       </w:r>
-                      <w:bookmarkEnd w:id="94"/>
+                      <w:bookmarkEnd w:id="95"/>
                     </w:p>
                   </w:txbxContent>
                 </v:textbox>
@@ -39849,37 +39404,27 @@
                                 <w:lang w:eastAsia="zh-CN" w:bidi="hi-IN"/>
                               </w:rPr>
                             </w:pPr>
-                            <w:bookmarkStart w:id="95" w:name="_Ref12495176"/>
-                            <w:bookmarkStart w:id="96" w:name="_Toc12497139"/>
+                            <w:bookmarkStart w:id="96" w:name="_Ref12495176"/>
+                            <w:bookmarkStart w:id="97" w:name="_Toc12497139"/>
                             <w:r>
                               <w:t xml:space="preserve">Şekil </w:t>
                             </w:r>
-                            <w:r>
-                              <w:fldChar w:fldCharType="begin"/>
-                            </w:r>
-                            <w:r>
-                              <w:instrText xml:space="preserve"> SEQ Şekil \* ARABIC </w:instrText>
-                            </w:r>
-                            <w:r>
-                              <w:fldChar w:fldCharType="separate"/>
-                            </w:r>
-                            <w:r>
-                              <w:rPr>
-                                <w:noProof/>
-                              </w:rPr>
-                              <w:t>26</w:t>
-                            </w:r>
-                            <w:r>
-                              <w:fldChar w:fldCharType="end"/>
-                            </w:r>
-                            <w:bookmarkEnd w:id="95"/>
+                            <w:fldSimple w:instr=" SEQ Şekil \* ARABIC ">
+                              <w:r>
+                                <w:rPr>
+                                  <w:noProof/>
+                                </w:rPr>
+                                <w:t>26</w:t>
+                              </w:r>
+                            </w:fldSimple>
+                            <w:bookmarkEnd w:id="96"/>
                             <w:r>
                               <w:t xml:space="preserve">. </w:t>
                             </w:r>
                             <w:r>
                               <w:t>Benchmark Sonuçları (Logaritmik)</w:t>
                             </w:r>
-                            <w:bookmarkEnd w:id="96"/>
+                            <w:bookmarkEnd w:id="97"/>
                           </w:p>
                         </w:txbxContent>
                       </wps:txbx>
@@ -39910,37 +39455,27 @@
                           <w:lang w:eastAsia="zh-CN" w:bidi="hi-IN"/>
                         </w:rPr>
                       </w:pPr>
-                      <w:bookmarkStart w:id="97" w:name="_Ref12495176"/>
-                      <w:bookmarkStart w:id="98" w:name="_Toc12497139"/>
+                      <w:bookmarkStart w:id="98" w:name="_Ref12495176"/>
+                      <w:bookmarkStart w:id="99" w:name="_Toc12497139"/>
                       <w:r>
                         <w:t xml:space="preserve">Şekil </w:t>
                       </w:r>
-                      <w:r>
-                        <w:fldChar w:fldCharType="begin"/>
-                      </w:r>
-                      <w:r>
-                        <w:instrText xml:space="preserve"> SEQ Şekil \* ARABIC </w:instrText>
-                      </w:r>
-                      <w:r>
-                        <w:fldChar w:fldCharType="separate"/>
-                      </w:r>
-                      <w:r>
-                        <w:rPr>
-                          <w:noProof/>
-                        </w:rPr>
-                        <w:t>26</w:t>
-                      </w:r>
-                      <w:r>
-                        <w:fldChar w:fldCharType="end"/>
-                      </w:r>
-                      <w:bookmarkEnd w:id="97"/>
+                      <w:fldSimple w:instr=" SEQ Şekil \* ARABIC ">
+                        <w:r>
+                          <w:rPr>
+                            <w:noProof/>
+                          </w:rPr>
+                          <w:t>26</w:t>
+                        </w:r>
+                      </w:fldSimple>
+                      <w:bookmarkEnd w:id="98"/>
                       <w:r>
                         <w:t xml:space="preserve">. </w:t>
                       </w:r>
                       <w:r>
                         <w:t>Benchmark Sonuçları (Logaritmik)</w:t>
                       </w:r>
-                      <w:bookmarkEnd w:id="98"/>
+                      <w:bookmarkEnd w:id="99"/>
                     </w:p>
                   </w:txbxContent>
                 </v:textbox>
@@ -43867,8 +43402,6 @@
         </w:rPr>
         <w:fldChar w:fldCharType="end"/>
       </w:r>
-      <w:bookmarkStart w:id="99" w:name="_GoBack"/>
-      <w:bookmarkEnd w:id="99"/>
     </w:p>
     <w:p>
       <w:pPr>
@@ -50612,6 +50145,7 @@
   <w:style w:type="character" w:default="1" w:styleId="DefaultParagraphFont">
     <w:name w:val="Default Paragraph Font"/>
     <w:uiPriority w:val="1"/>
+    <w:semiHidden/>
     <w:unhideWhenUsed/>
   </w:style>
   <w:style w:type="table" w:default="1" w:styleId="TableNormal">
@@ -52370,7 +51904,7 @@
 </file>
 
 <file path=customXml/itemProps1.xml><?xml version="1.0" encoding="utf-8"?>
-<ds:datastoreItem xmlns:ds="http://schemas.openxmlformats.org/officeDocument/2006/customXml" ds:itemID="{553A1964-2B6A-48A3-9C00-A8C982E44409}">
+<ds:datastoreItem xmlns:ds="http://schemas.openxmlformats.org/officeDocument/2006/customXml" ds:itemID="{E2CD44C7-BE86-47A2-A075-6217A3EE19A0}">
   <ds:schemaRefs>
     <ds:schemaRef ds:uri="http://schemas.openxmlformats.org/officeDocument/2006/bibliography"/>
   </ds:schemaRefs>

</xml_diff>